<commit_message>
Updated Resume and Website 06/23
</commit_message>
<xml_diff>
--- a/AnishBandaResume.docx
+++ b/AnishBandaResume.docx
@@ -173,7 +173,23 @@
           <w:szCs w:val="20"/>
         </w:rPr>
         <w:tab/>
-        <w:t xml:space="preserve">              </w:t>
+        <w:t xml:space="preserve">             </w:t>
+      </w:r>
+      <w:r>
+        <w:rPr>
+          <w:rFonts w:ascii="Garamond" w:eastAsia="Garamond" w:hAnsi="Garamond" w:cs="Garamond"/>
+          <w:sz w:val="20"/>
+          <w:szCs w:val="20"/>
+        </w:rPr>
+        <w:t xml:space="preserve">     </w:t>
+      </w:r>
+      <w:r>
+        <w:rPr>
+          <w:rFonts w:ascii="Garamond" w:eastAsia="Garamond" w:hAnsi="Garamond" w:cs="Garamond"/>
+          <w:sz w:val="20"/>
+          <w:szCs w:val="20"/>
+        </w:rPr>
+        <w:t xml:space="preserve"> </w:t>
       </w:r>
       <w:r>
         <w:rPr>
@@ -202,10 +218,26 @@
       <w:r>
         <w:rPr>
           <w:rFonts w:ascii="Garamond" w:eastAsia="Garamond" w:hAnsi="Garamond" w:cs="Garamond"/>
-          <w:sz w:val="20"/>
-          <w:szCs w:val="20"/>
-        </w:rPr>
-        <w:t>1400 Black Oak Dr.</w:t>
+          <w:sz w:val="2"/>
+          <w:szCs w:val="2"/>
+        </w:rPr>
+        <w:t xml:space="preserve">                              </w:t>
+      </w:r>
+      <w:r>
+        <w:rPr>
+          <w:rFonts w:ascii="Garamond" w:eastAsia="Garamond" w:hAnsi="Garamond" w:cs="Garamond"/>
+          <w:sz w:val="20"/>
+          <w:szCs w:val="20"/>
+        </w:rPr>
+        <w:t>3402 Titan Dr</w:t>
+      </w:r>
+      <w:r>
+        <w:rPr>
+          <w:rFonts w:ascii="Garamond" w:eastAsia="Garamond" w:hAnsi="Garamond" w:cs="Garamond"/>
+          <w:sz w:val="20"/>
+          <w:szCs w:val="20"/>
+        </w:rPr>
+        <w:t>.</w:t>
       </w:r>
     </w:p>
     <w:p>
@@ -314,25 +346,7 @@
             <w:sz w:val="20"/>
             <w:szCs w:val="20"/>
           </w:rPr>
-          <w:t>anish</w:t>
-        </w:r>
-        <w:r>
-          <w:rPr>
-            <w:rStyle w:val="Hyperlink"/>
-            <w:rFonts w:ascii="Garamond" w:eastAsia="Garamond" w:hAnsi="Garamond" w:cs="Garamond"/>
-            <w:sz w:val="20"/>
-            <w:szCs w:val="20"/>
-          </w:rPr>
-          <w:t>b</w:t>
-        </w:r>
-        <w:r>
-          <w:rPr>
-            <w:rStyle w:val="Hyperlink"/>
-            <w:rFonts w:ascii="Garamond" w:eastAsia="Garamond" w:hAnsi="Garamond" w:cs="Garamond"/>
-            <w:sz w:val="20"/>
-            <w:szCs w:val="20"/>
-          </w:rPr>
-          <w:t>anda</w:t>
+          <w:t>anishbanda</w:t>
         </w:r>
         <w:proofErr w:type="spellEnd"/>
       </w:hyperlink>
@@ -420,7 +434,7 @@
           <w:sz w:val="20"/>
           <w:szCs w:val="20"/>
         </w:rPr>
-        <w:t>6</w:t>
+        <w:t>5</w:t>
       </w:r>
     </w:p>
     <w:p>
@@ -716,7 +730,25 @@
           <w:sz w:val="20"/>
           <w:szCs w:val="20"/>
         </w:rPr>
-        <w:t xml:space="preserve">Area of Expertise in </w:t>
+        <w:t xml:space="preserve">Area of </w:t>
+      </w:r>
+      <w:r>
+        <w:rPr>
+          <w:rFonts w:ascii="Garamond" w:eastAsia="Garamond" w:hAnsi="Garamond" w:cs="Garamond"/>
+          <w:color w:val="000000"/>
+          <w:sz w:val="20"/>
+          <w:szCs w:val="20"/>
+        </w:rPr>
+        <w:t>Emphasis</w:t>
+      </w:r>
+      <w:r>
+        <w:rPr>
+          <w:rFonts w:ascii="Garamond" w:eastAsia="Garamond" w:hAnsi="Garamond" w:cs="Garamond"/>
+          <w:color w:val="000000"/>
+          <w:sz w:val="20"/>
+          <w:szCs w:val="20"/>
+        </w:rPr>
+        <w:t xml:space="preserve"> in </w:t>
       </w:r>
       <w:r>
         <w:rPr>
@@ -792,16 +824,7 @@
           <w:sz w:val="20"/>
           <w:szCs w:val="20"/>
         </w:rPr>
-        <w:t>6</w:t>
-      </w:r>
-      <w:r>
-        <w:rPr>
-          <w:rFonts w:ascii="Garamond" w:eastAsia="Garamond" w:hAnsi="Garamond" w:cs="Garamond"/>
-          <w:color w:val="000000"/>
-          <w:sz w:val="20"/>
-          <w:szCs w:val="20"/>
-        </w:rPr>
-        <w:t>5</w:t>
+        <w:t>7</w:t>
       </w:r>
       <w:r>
         <w:rPr>
@@ -920,129 +943,6 @@
           <w:sz w:val="20"/>
           <w:szCs w:val="20"/>
         </w:rPr>
-        <w:t>Relevant Coursework</w:t>
-      </w:r>
-      <w:r>
-        <w:rPr>
-          <w:rFonts w:ascii="Garamond" w:eastAsia="Garamond" w:hAnsi="Garamond" w:cs="Garamond"/>
-          <w:color w:val="000000"/>
-          <w:sz w:val="20"/>
-          <w:szCs w:val="20"/>
-        </w:rPr>
-        <w:t xml:space="preserve">: </w:t>
-      </w:r>
-      <w:r>
-        <w:rPr>
-          <w:rFonts w:ascii="Garamond" w:eastAsia="Garamond" w:hAnsi="Garamond" w:cs="Garamond"/>
-          <w:color w:val="000000"/>
-          <w:sz w:val="20"/>
-          <w:szCs w:val="20"/>
-        </w:rPr>
-        <w:t>Data Structures</w:t>
-      </w:r>
-      <w:r>
-        <w:rPr>
-          <w:rFonts w:ascii="Garamond" w:eastAsia="Garamond" w:hAnsi="Garamond" w:cs="Garamond"/>
-          <w:color w:val="000000"/>
-          <w:sz w:val="20"/>
-          <w:szCs w:val="20"/>
-        </w:rPr>
-        <w:t>, Linear Algebra,</w:t>
-      </w:r>
-      <w:r>
-        <w:rPr>
-          <w:rFonts w:ascii="Garamond" w:eastAsia="Garamond" w:hAnsi="Garamond" w:cs="Garamond"/>
-          <w:color w:val="000000"/>
-          <w:sz w:val="20"/>
-          <w:szCs w:val="20"/>
-        </w:rPr>
-        <w:t xml:space="preserve"> Multivariable Calculus</w:t>
-      </w:r>
-      <w:r>
-        <w:rPr>
-          <w:rFonts w:ascii="Garamond" w:eastAsia="Garamond" w:hAnsi="Garamond" w:cs="Garamond"/>
-          <w:color w:val="000000"/>
-          <w:sz w:val="20"/>
-          <w:szCs w:val="20"/>
-        </w:rPr>
-        <w:t xml:space="preserve">, </w:t>
-      </w:r>
-      <w:r>
-        <w:rPr>
-          <w:rFonts w:ascii="Garamond" w:eastAsia="Garamond" w:hAnsi="Garamond" w:cs="Garamond"/>
-          <w:color w:val="000000"/>
-          <w:sz w:val="20"/>
-          <w:szCs w:val="20"/>
-        </w:rPr>
-        <w:t>Int</w:t>
-      </w:r>
-      <w:r>
-        <w:rPr>
-          <w:rFonts w:ascii="Garamond" w:eastAsia="Garamond" w:hAnsi="Garamond" w:cs="Garamond"/>
-          <w:color w:val="000000"/>
-          <w:sz w:val="20"/>
-          <w:szCs w:val="20"/>
-        </w:rPr>
-        <w:t>r</w:t>
-      </w:r>
-      <w:r>
-        <w:rPr>
-          <w:rFonts w:ascii="Garamond" w:eastAsia="Garamond" w:hAnsi="Garamond" w:cs="Garamond"/>
-          <w:color w:val="000000"/>
-          <w:sz w:val="20"/>
-          <w:szCs w:val="20"/>
-        </w:rPr>
-        <w:t>o to Computational Investin</w:t>
-      </w:r>
-      <w:r>
-        <w:rPr>
-          <w:rFonts w:ascii="Garamond" w:eastAsia="Garamond" w:hAnsi="Garamond" w:cs="Garamond"/>
-          <w:color w:val="000000"/>
-          <w:sz w:val="20"/>
-          <w:szCs w:val="20"/>
-        </w:rPr>
-        <w:t xml:space="preserve">g, </w:t>
-      </w:r>
-      <w:r>
-        <w:rPr>
-          <w:rFonts w:ascii="Garamond" w:eastAsia="Garamond" w:hAnsi="Garamond" w:cs="Garamond"/>
-          <w:bCs/>
-          <w:color w:val="000000"/>
-          <w:sz w:val="20"/>
-          <w:szCs w:val="20"/>
-        </w:rPr>
-        <w:t>Computer Architecture and Organization, Artificial Intelligence, Algorithms, and Deep Learning and Generative AI</w:t>
-      </w:r>
-    </w:p>
-    <w:p>
-      <w:pPr>
-        <w:numPr>
-          <w:ilvl w:val="0"/>
-          <w:numId w:val="8"/>
-        </w:numPr>
-        <w:pBdr>
-          <w:top w:val="nil"/>
-          <w:left w:val="nil"/>
-          <w:bottom w:val="nil"/>
-          <w:right w:val="nil"/>
-          <w:between w:val="nil"/>
-        </w:pBdr>
-        <w:rPr>
-          <w:rFonts w:ascii="Garamond" w:eastAsia="Garamond" w:hAnsi="Garamond" w:cs="Garamond"/>
-          <w:b/>
-          <w:color w:val="000000"/>
-          <w:sz w:val="20"/>
-          <w:szCs w:val="20"/>
-        </w:rPr>
-      </w:pPr>
-      <w:r>
-        <w:rPr>
-          <w:rFonts w:ascii="Garamond" w:eastAsia="Garamond" w:hAnsi="Garamond" w:cs="Garamond"/>
-          <w:b/>
-          <w:color w:val="000000"/>
-          <w:sz w:val="20"/>
-          <w:szCs w:val="20"/>
-        </w:rPr>
         <w:t xml:space="preserve">Selected Participant: </w:t>
       </w:r>
       <w:r>
@@ -1154,7 +1054,7 @@
           <w:sz w:val="20"/>
           <w:szCs w:val="20"/>
         </w:rPr>
-        <w:t>UltraRep LLC</w:t>
+        <w:t>Fidelity Investments</w:t>
       </w:r>
       <w:r>
         <w:rPr>
@@ -1167,86 +1067,11 @@
       <w:r>
         <w:rPr>
           <w:rFonts w:ascii="Garamond" w:eastAsia="Garamond" w:hAnsi="Garamond" w:cs="Garamond"/>
-          <w:sz w:val="20"/>
-          <w:szCs w:val="20"/>
-        </w:rPr>
-        <w:t xml:space="preserve">Backend </w:t>
-      </w:r>
-      <w:r>
-        <w:rPr>
-          <w:rFonts w:ascii="Garamond" w:eastAsia="Garamond" w:hAnsi="Garamond" w:cs="Garamond"/>
           <w:iCs/>
           <w:sz w:val="20"/>
           <w:szCs w:val="20"/>
         </w:rPr>
-        <w:t>Software Engineer</w:t>
-      </w:r>
-      <w:r>
-        <w:rPr>
-          <w:rFonts w:ascii="Garamond" w:eastAsia="Garamond" w:hAnsi="Garamond" w:cs="Garamond"/>
-          <w:iCs/>
-          <w:sz w:val="20"/>
-          <w:szCs w:val="20"/>
-        </w:rPr>
-        <w:t>ing</w:t>
-      </w:r>
-      <w:r>
-        <w:rPr>
-          <w:rFonts w:ascii="Garamond" w:eastAsia="Garamond" w:hAnsi="Garamond" w:cs="Garamond"/>
-          <w:iCs/>
-          <w:sz w:val="20"/>
-          <w:szCs w:val="20"/>
-        </w:rPr>
-        <w:t xml:space="preserve"> Intern</w:t>
-      </w:r>
-      <w:r>
-        <w:rPr>
-          <w:rFonts w:ascii="Garamond" w:eastAsia="Garamond" w:hAnsi="Garamond" w:cs="Garamond"/>
-          <w:iCs/>
-          <w:sz w:val="20"/>
-          <w:szCs w:val="20"/>
-        </w:rPr>
-        <w:t>,</w:t>
-      </w:r>
-      <w:r>
-        <w:rPr>
-          <w:rFonts w:ascii="Garamond" w:eastAsia="Garamond" w:hAnsi="Garamond" w:cs="Garamond"/>
-          <w:sz w:val="20"/>
-          <w:szCs w:val="20"/>
-        </w:rPr>
-        <w:t xml:space="preserve"> Remote</w:t>
-      </w:r>
-      <w:r>
-        <w:rPr>
-          <w:rFonts w:ascii="Garamond" w:eastAsia="Garamond" w:hAnsi="Garamond" w:cs="Garamond"/>
-          <w:sz w:val="20"/>
-          <w:szCs w:val="20"/>
-        </w:rPr>
-        <w:t xml:space="preserve"> (Java, OpenAI, APIs, R</w:t>
-      </w:r>
-      <w:r>
-        <w:rPr>
-          <w:rFonts w:ascii="Garamond" w:eastAsia="Garamond" w:hAnsi="Garamond" w:cs="Garamond"/>
-          <w:sz w:val="20"/>
-          <w:szCs w:val="20"/>
-        </w:rPr>
-        <w:t xml:space="preserve">edis) </w:t>
-      </w:r>
-      <w:r>
-        <w:rPr>
-          <w:rFonts w:ascii="Garamond" w:eastAsia="Garamond" w:hAnsi="Garamond" w:cs="Garamond"/>
-          <w:sz w:val="20"/>
-          <w:szCs w:val="20"/>
-        </w:rPr>
-        <w:t xml:space="preserve">                      </w:t>
-      </w:r>
-      <w:r>
-        <w:rPr>
-          <w:rFonts w:ascii="Garamond" w:eastAsia="Garamond" w:hAnsi="Garamond" w:cs="Garamond"/>
-          <w:sz w:val="20"/>
-          <w:szCs w:val="20"/>
-        </w:rPr>
-        <w:t xml:space="preserve">      </w:t>
+        <w:t>Software Engineering Intern,</w:t>
       </w:r>
       <w:r>
         <w:rPr>
@@ -1262,15 +1087,71 @@
           <w:sz w:val="20"/>
           <w:szCs w:val="20"/>
         </w:rPr>
+        <w:t xml:space="preserve">Westlake, TX </w:t>
+      </w:r>
+      <w:r>
+        <w:rPr>
+          <w:rFonts w:ascii="Garamond" w:eastAsia="Garamond" w:hAnsi="Garamond" w:cs="Garamond"/>
+          <w:sz w:val="20"/>
+          <w:szCs w:val="20"/>
+        </w:rPr>
+        <w:t xml:space="preserve">(Java, </w:t>
+      </w:r>
+      <w:r>
+        <w:rPr>
+          <w:rFonts w:ascii="Garamond" w:eastAsia="Garamond" w:hAnsi="Garamond" w:cs="Garamond"/>
+          <w:sz w:val="20"/>
+          <w:szCs w:val="20"/>
+        </w:rPr>
+        <w:t>Spring/Spring Boot</w:t>
+      </w:r>
+      <w:r>
+        <w:rPr>
+          <w:rFonts w:ascii="Garamond" w:eastAsia="Garamond" w:hAnsi="Garamond" w:cs="Garamond"/>
+          <w:sz w:val="20"/>
+          <w:szCs w:val="20"/>
+        </w:rPr>
+        <w:t>, APIs</w:t>
+      </w:r>
+      <w:r>
+        <w:rPr>
+          <w:rFonts w:ascii="Garamond" w:eastAsia="Garamond" w:hAnsi="Garamond" w:cs="Garamond"/>
+          <w:sz w:val="20"/>
+          <w:szCs w:val="20"/>
+        </w:rPr>
+        <w:t xml:space="preserve">) </w:t>
+      </w:r>
+      <w:r>
+        <w:rPr>
+          <w:rFonts w:ascii="Garamond" w:eastAsia="Garamond" w:hAnsi="Garamond" w:cs="Garamond"/>
+          <w:sz w:val="20"/>
+          <w:szCs w:val="20"/>
+        </w:rPr>
+        <w:t xml:space="preserve">                 </w:t>
+      </w:r>
+      <w:r>
+        <w:rPr>
+          <w:rFonts w:ascii="Garamond" w:eastAsia="Garamond" w:hAnsi="Garamond" w:cs="Garamond"/>
+          <w:sz w:val="20"/>
+          <w:szCs w:val="20"/>
+        </w:rPr>
+        <w:t xml:space="preserve">    </w:t>
+      </w:r>
+      <w:r>
+        <w:rPr>
+          <w:rFonts w:ascii="Garamond" w:eastAsia="Garamond" w:hAnsi="Garamond" w:cs="Garamond"/>
+          <w:sz w:val="20"/>
+          <w:szCs w:val="20"/>
+        </w:rPr>
+        <w:t xml:space="preserve">    </w:t>
+      </w:r>
+      <w:r>
+        <w:rPr>
+          <w:rFonts w:ascii="Garamond" w:eastAsia="Garamond" w:hAnsi="Garamond" w:cs="Garamond"/>
+          <w:sz w:val="20"/>
+          <w:szCs w:val="20"/>
+        </w:rPr>
         <w:t xml:space="preserve">   </w:t>
-      </w:r>
-      <w:r>
-        <w:rPr>
-          <w:rFonts w:ascii="Garamond" w:eastAsia="Garamond" w:hAnsi="Garamond" w:cs="Garamond"/>
-          <w:sz w:val="20"/>
-          <w:szCs w:val="20"/>
-        </w:rPr>
-        <w:t xml:space="preserve">      </w:t>
       </w:r>
       <w:r>
         <w:rPr>
@@ -1278,7 +1159,7 @@
           <w:sz w:val="2"/>
           <w:szCs w:val="2"/>
         </w:rPr>
-        <w:t xml:space="preserve">            </w:t>
+        <w:t xml:space="preserve">                  </w:t>
       </w:r>
       <w:r>
         <w:rPr>
@@ -1286,6 +1167,14 @@
           <w:sz w:val="2"/>
           <w:szCs w:val="2"/>
         </w:rPr>
+        <w:t xml:space="preserve">    </w:t>
+      </w:r>
+      <w:r>
+        <w:rPr>
+          <w:rFonts w:ascii="Garamond" w:eastAsia="Garamond" w:hAnsi="Garamond" w:cs="Garamond"/>
+          <w:sz w:val="2"/>
+          <w:szCs w:val="2"/>
+        </w:rPr>
         <w:t xml:space="preserve">  </w:t>
       </w:r>
       <w:r>
@@ -1302,22 +1191,6 @@
           <w:sz w:val="20"/>
           <w:szCs w:val="20"/>
         </w:rPr>
-        <w:t xml:space="preserve"> 2025 </w:t>
-      </w:r>
-      <w:r>
-        <w:rPr>
-          <w:rFonts w:ascii="Garamond" w:eastAsia="Garamond" w:hAnsi="Garamond" w:cs="Garamond"/>
-          <w:sz w:val="20"/>
-          <w:szCs w:val="20"/>
-        </w:rPr>
-        <w:t>-</w:t>
-      </w:r>
-      <w:r>
-        <w:rPr>
-          <w:rFonts w:ascii="Garamond" w:eastAsia="Garamond" w:hAnsi="Garamond" w:cs="Garamond"/>
-          <w:sz w:val="20"/>
-          <w:szCs w:val="20"/>
-        </w:rPr>
         <w:t xml:space="preserve"> </w:t>
       </w:r>
       <w:r>
@@ -1326,23 +1199,15 @@
           <w:sz w:val="20"/>
           <w:szCs w:val="20"/>
         </w:rPr>
-        <w:t>Aug</w:t>
-      </w:r>
-      <w:r>
-        <w:rPr>
-          <w:rFonts w:ascii="Garamond" w:eastAsia="Garamond" w:hAnsi="Garamond" w:cs="Garamond"/>
-          <w:sz w:val="20"/>
-          <w:szCs w:val="20"/>
-        </w:rPr>
-        <w:t xml:space="preserve"> 2025</w:t>
-      </w:r>
-      <w:r>
-        <w:rPr>
-          <w:rFonts w:ascii="Garamond" w:eastAsia="Garamond" w:hAnsi="Garamond" w:cs="Garamond"/>
-          <w:sz w:val="20"/>
-          <w:szCs w:val="20"/>
-        </w:rPr>
-        <w:t xml:space="preserve">                                                                                         </w:t>
+        <w:t>2026</w:t>
+      </w:r>
+      <w:r>
+        <w:rPr>
+          <w:rFonts w:ascii="Garamond" w:eastAsia="Garamond" w:hAnsi="Garamond" w:cs="Garamond"/>
+          <w:sz w:val="20"/>
+          <w:szCs w:val="20"/>
+        </w:rPr>
+        <w:t xml:space="preserve"> - Present</w:t>
       </w:r>
     </w:p>
     <w:p>
@@ -1372,7 +1237,110 @@
           <w:sz w:val="20"/>
           <w:szCs w:val="20"/>
         </w:rPr>
-        <w:t>Built a REST endpoint that took conversation JSON as input, called the OpenAI API to generate coaching feedback, and returned a structured JSON response that the frontend could render reliably.</w:t>
+        <w:t>Building the</w:t>
+      </w:r>
+      <w:r>
+        <w:rPr>
+          <w:rFonts w:ascii="Garamond" w:eastAsia="Garamond" w:hAnsi="Garamond" w:cs="Garamond"/>
+          <w:color w:val="000000"/>
+          <w:sz w:val="20"/>
+          <w:szCs w:val="20"/>
+        </w:rPr>
+        <w:t xml:space="preserve"> APEX Reporting Engine for FFIO Core Accounting which executes Spectra queries </w:t>
+      </w:r>
+      <w:r>
+        <w:rPr>
+          <w:rFonts w:ascii="Garamond" w:eastAsia="Garamond" w:hAnsi="Garamond" w:cs="Garamond"/>
+          <w:color w:val="000000"/>
+          <w:sz w:val="20"/>
+          <w:szCs w:val="20"/>
+        </w:rPr>
+        <w:t>to</w:t>
+      </w:r>
+      <w:r>
+        <w:rPr>
+          <w:rFonts w:ascii="Garamond" w:eastAsia="Garamond" w:hAnsi="Garamond" w:cs="Garamond"/>
+          <w:color w:val="000000"/>
+          <w:sz w:val="20"/>
+          <w:szCs w:val="20"/>
+        </w:rPr>
+        <w:t xml:space="preserve"> surface fund accounting data from </w:t>
+      </w:r>
+      <w:proofErr w:type="spellStart"/>
+      <w:r>
+        <w:rPr>
+          <w:rFonts w:ascii="Garamond" w:eastAsia="Garamond" w:hAnsi="Garamond" w:cs="Garamond"/>
+          <w:color w:val="000000"/>
+          <w:sz w:val="20"/>
+          <w:szCs w:val="20"/>
+        </w:rPr>
+        <w:t>InvestOne</w:t>
+      </w:r>
+      <w:proofErr w:type="spellEnd"/>
+      <w:r>
+        <w:rPr>
+          <w:rFonts w:ascii="Garamond" w:eastAsia="Garamond" w:hAnsi="Garamond" w:cs="Garamond"/>
+          <w:color w:val="000000"/>
+          <w:sz w:val="20"/>
+          <w:szCs w:val="20"/>
+        </w:rPr>
+        <w:t xml:space="preserve"> </w:t>
+      </w:r>
+      <w:r>
+        <w:rPr>
+          <w:rFonts w:ascii="Garamond" w:eastAsia="Garamond" w:hAnsi="Garamond" w:cs="Garamond"/>
+          <w:color w:val="000000"/>
+          <w:sz w:val="20"/>
+          <w:szCs w:val="20"/>
+        </w:rPr>
+        <w:t>and drive</w:t>
+      </w:r>
+      <w:r>
+        <w:rPr>
+          <w:rFonts w:ascii="Garamond" w:eastAsia="Garamond" w:hAnsi="Garamond" w:cs="Garamond"/>
+          <w:color w:val="000000"/>
+          <w:sz w:val="20"/>
+          <w:szCs w:val="20"/>
+        </w:rPr>
+        <w:t xml:space="preserve"> migrat</w:t>
+      </w:r>
+      <w:r>
+        <w:rPr>
+          <w:rFonts w:ascii="Garamond" w:eastAsia="Garamond" w:hAnsi="Garamond" w:cs="Garamond"/>
+          <w:color w:val="000000"/>
+          <w:sz w:val="20"/>
+          <w:szCs w:val="20"/>
+        </w:rPr>
+        <w:t>ion</w:t>
+      </w:r>
+      <w:r>
+        <w:rPr>
+          <w:rFonts w:ascii="Garamond" w:eastAsia="Garamond" w:hAnsi="Garamond" w:cs="Garamond"/>
+          <w:color w:val="000000"/>
+          <w:sz w:val="20"/>
+          <w:szCs w:val="20"/>
+        </w:rPr>
+        <w:t xml:space="preserve"> to </w:t>
+      </w:r>
+      <w:proofErr w:type="spellStart"/>
+      <w:r>
+        <w:rPr>
+          <w:rFonts w:ascii="Garamond" w:eastAsia="Garamond" w:hAnsi="Garamond" w:cs="Garamond"/>
+          <w:color w:val="000000"/>
+          <w:sz w:val="20"/>
+          <w:szCs w:val="20"/>
+        </w:rPr>
+        <w:t>HedgeServ</w:t>
+      </w:r>
+      <w:proofErr w:type="spellEnd"/>
+      <w:r>
+        <w:rPr>
+          <w:rFonts w:ascii="Garamond" w:eastAsia="Garamond" w:hAnsi="Garamond" w:cs="Garamond"/>
+          <w:color w:val="000000"/>
+          <w:sz w:val="20"/>
+          <w:szCs w:val="20"/>
+        </w:rPr>
+        <w:t>.</w:t>
       </w:r>
     </w:p>
     <w:p>
@@ -1402,16 +1370,52 @@
           <w:sz w:val="20"/>
           <w:szCs w:val="20"/>
         </w:rPr>
-        <w:t>Added a strict response validation (required fields and type checks) and error handling for timeouts and malformed/unexpected response formats so the endpoint didn’t crash on bad upstream output</w:t>
-      </w:r>
-      <w:r>
-        <w:rPr>
-          <w:rFonts w:ascii="Garamond" w:eastAsia="Garamond" w:hAnsi="Garamond" w:cs="Garamond"/>
-          <w:color w:val="000000"/>
-          <w:sz w:val="20"/>
-          <w:szCs w:val="20"/>
-        </w:rPr>
-        <w:t>.</w:t>
+        <w:t>Migrat</w:t>
+      </w:r>
+      <w:r>
+        <w:rPr>
+          <w:rFonts w:ascii="Garamond" w:eastAsia="Garamond" w:hAnsi="Garamond" w:cs="Garamond"/>
+          <w:color w:val="000000"/>
+          <w:sz w:val="20"/>
+          <w:szCs w:val="20"/>
+        </w:rPr>
+        <w:t>ed</w:t>
+      </w:r>
+      <w:r>
+        <w:rPr>
+          <w:rFonts w:ascii="Garamond" w:eastAsia="Garamond" w:hAnsi="Garamond" w:cs="Garamond"/>
+          <w:color w:val="000000"/>
+          <w:sz w:val="20"/>
+          <w:szCs w:val="20"/>
+        </w:rPr>
+        <w:t xml:space="preserve"> EDWAM service logic for WAM/WAL calculations into APEX, consolidating </w:t>
+      </w:r>
+      <w:r>
+        <w:rPr>
+          <w:rFonts w:ascii="Garamond" w:eastAsia="Garamond" w:hAnsi="Garamond" w:cs="Garamond"/>
+          <w:color w:val="000000"/>
+          <w:sz w:val="20"/>
+          <w:szCs w:val="20"/>
+        </w:rPr>
+        <w:t>core</w:t>
+      </w:r>
+      <w:r>
+        <w:rPr>
+          <w:rFonts w:ascii="Garamond" w:eastAsia="Garamond" w:hAnsi="Garamond" w:cs="Garamond"/>
+          <w:color w:val="000000"/>
+          <w:sz w:val="20"/>
+          <w:szCs w:val="20"/>
+        </w:rPr>
+        <w:t xml:space="preserve"> accounting functionality into the main platform</w:t>
+      </w:r>
+      <w:r>
+        <w:rPr>
+          <w:rFonts w:ascii="Garamond" w:eastAsia="Garamond" w:hAnsi="Garamond" w:cs="Garamond"/>
+          <w:color w:val="000000"/>
+          <w:sz w:val="20"/>
+          <w:szCs w:val="20"/>
+        </w:rPr>
+        <w:t xml:space="preserve"> and reducing fragmented service dependencies.</w:t>
       </w:r>
     </w:p>
     <w:p>
@@ -1429,27 +1433,113 @@
         </w:pBdr>
         <w:rPr>
           <w:rFonts w:ascii="Garamond" w:eastAsia="Garamond" w:hAnsi="Garamond" w:cs="Garamond"/>
-          <w:sz w:val="20"/>
-          <w:szCs w:val="20"/>
-        </w:rPr>
-      </w:pPr>
-      <w:r>
-        <w:rPr>
-          <w:rFonts w:ascii="Garamond" w:eastAsia="Garamond" w:hAnsi="Garamond" w:cs="Garamond"/>
-          <w:color w:val="000000"/>
-          <w:sz w:val="20"/>
-          <w:szCs w:val="20"/>
-        </w:rPr>
-        <w:t>Wrote JUnit tests that mocked the OpenAI client across success and failure paths (timeout, non-200, missing fields) and asserted the endpoint returns a consistent fallback payload (‘status=degraded’, error_code, retryable, correlated id)</w:t>
-      </w:r>
-      <w:r>
-        <w:rPr>
-          <w:rFonts w:ascii="Garamond" w:eastAsia="Garamond" w:hAnsi="Garamond" w:cs="Garamond"/>
-          <w:color w:val="000000"/>
-          <w:sz w:val="20"/>
-          <w:szCs w:val="20"/>
-        </w:rPr>
-        <w:t>.</w:t>
+          <w:color w:val="000000"/>
+          <w:sz w:val="20"/>
+          <w:szCs w:val="20"/>
+        </w:rPr>
+      </w:pPr>
+      <w:r>
+        <w:rPr>
+          <w:rFonts w:ascii="Garamond" w:eastAsia="Garamond" w:hAnsi="Garamond" w:cs="Garamond"/>
+          <w:color w:val="000000"/>
+          <w:sz w:val="20"/>
+          <w:szCs w:val="20"/>
+        </w:rPr>
+        <w:t>Designed</w:t>
+      </w:r>
+      <w:r>
+        <w:rPr>
+          <w:rFonts w:ascii="Garamond" w:eastAsia="Garamond" w:hAnsi="Garamond" w:cs="Garamond"/>
+          <w:color w:val="000000"/>
+          <w:sz w:val="20"/>
+          <w:szCs w:val="20"/>
+        </w:rPr>
+        <w:t xml:space="preserve"> reusable HTTP clients modeled after </w:t>
+      </w:r>
+      <w:proofErr w:type="spellStart"/>
+      <w:r>
+        <w:rPr>
+          <w:rFonts w:ascii="Garamond" w:eastAsia="Garamond" w:hAnsi="Garamond" w:cs="Garamond"/>
+          <w:color w:val="000000"/>
+          <w:sz w:val="20"/>
+          <w:szCs w:val="20"/>
+        </w:rPr>
+        <w:t>CDPClient</w:t>
+      </w:r>
+      <w:proofErr w:type="spellEnd"/>
+      <w:r>
+        <w:rPr>
+          <w:rFonts w:ascii="Garamond" w:eastAsia="Garamond" w:hAnsi="Garamond" w:cs="Garamond"/>
+          <w:color w:val="000000"/>
+          <w:sz w:val="20"/>
+          <w:szCs w:val="20"/>
+        </w:rPr>
+        <w:t xml:space="preserve"> and </w:t>
+      </w:r>
+      <w:proofErr w:type="spellStart"/>
+      <w:r>
+        <w:rPr>
+          <w:rFonts w:ascii="Garamond" w:eastAsia="Garamond" w:hAnsi="Garamond" w:cs="Garamond"/>
+          <w:color w:val="000000"/>
+          <w:sz w:val="20"/>
+          <w:szCs w:val="20"/>
+        </w:rPr>
+        <w:t>WSOClient</w:t>
+      </w:r>
+      <w:proofErr w:type="spellEnd"/>
+      <w:r>
+        <w:rPr>
+          <w:rFonts w:ascii="Garamond" w:eastAsia="Garamond" w:hAnsi="Garamond" w:cs="Garamond"/>
+          <w:color w:val="000000"/>
+          <w:sz w:val="20"/>
+          <w:szCs w:val="20"/>
+        </w:rPr>
+        <w:t xml:space="preserve"> to invoke APEX report query APIs</w:t>
+      </w:r>
+      <w:r>
+        <w:rPr>
+          <w:rFonts w:ascii="Garamond" w:eastAsia="Garamond" w:hAnsi="Garamond" w:cs="Garamond"/>
+          <w:color w:val="000000"/>
+          <w:sz w:val="20"/>
+          <w:szCs w:val="20"/>
+        </w:rPr>
+        <w:t xml:space="preserve">, </w:t>
+      </w:r>
+      <w:r>
+        <w:rPr>
+          <w:rFonts w:ascii="Garamond" w:eastAsia="Garamond" w:hAnsi="Garamond" w:cs="Garamond"/>
+          <w:color w:val="000000"/>
+          <w:sz w:val="20"/>
+          <w:szCs w:val="20"/>
+        </w:rPr>
+        <w:t>standardiz</w:t>
+      </w:r>
+      <w:r>
+        <w:rPr>
+          <w:rFonts w:ascii="Garamond" w:eastAsia="Garamond" w:hAnsi="Garamond" w:cs="Garamond"/>
+          <w:color w:val="000000"/>
+          <w:sz w:val="20"/>
+          <w:szCs w:val="20"/>
+        </w:rPr>
+        <w:t>ing</w:t>
+      </w:r>
+      <w:r>
+        <w:rPr>
+          <w:rFonts w:ascii="Garamond" w:eastAsia="Garamond" w:hAnsi="Garamond" w:cs="Garamond"/>
+          <w:color w:val="000000"/>
+          <w:sz w:val="20"/>
+          <w:szCs w:val="20"/>
+        </w:rPr>
+        <w:t xml:space="preserve"> service-to-service report retrieval</w:t>
+      </w:r>
+      <w:r>
+        <w:rPr>
+          <w:rFonts w:ascii="Garamond" w:eastAsia="Garamond" w:hAnsi="Garamond" w:cs="Garamond"/>
+          <w:color w:val="000000"/>
+          <w:sz w:val="20"/>
+          <w:szCs w:val="20"/>
+        </w:rPr>
+        <w:t xml:space="preserve"> across the platform.</w:t>
       </w:r>
     </w:p>
     <w:p>
@@ -1467,6 +1557,405 @@
         </w:pBdr>
         <w:rPr>
           <w:rFonts w:ascii="Garamond" w:eastAsia="Garamond" w:hAnsi="Garamond" w:cs="Garamond"/>
+          <w:color w:val="000000"/>
+          <w:sz w:val="20"/>
+          <w:szCs w:val="20"/>
+        </w:rPr>
+      </w:pPr>
+      <w:r>
+        <w:rPr>
+          <w:rFonts w:ascii="Garamond" w:eastAsia="Garamond" w:hAnsi="Garamond" w:cs="Garamond"/>
+          <w:color w:val="000000"/>
+          <w:sz w:val="20"/>
+          <w:szCs w:val="20"/>
+        </w:rPr>
+        <w:t>Working</w:t>
+      </w:r>
+      <w:r>
+        <w:rPr>
+          <w:rFonts w:ascii="Garamond" w:eastAsia="Garamond" w:hAnsi="Garamond" w:cs="Garamond"/>
+          <w:color w:val="000000"/>
+          <w:sz w:val="20"/>
+          <w:szCs w:val="20"/>
+        </w:rPr>
+        <w:t xml:space="preserve"> </w:t>
+      </w:r>
+      <w:r>
+        <w:rPr>
+          <w:rFonts w:ascii="Garamond" w:eastAsia="Garamond" w:hAnsi="Garamond" w:cs="Garamond"/>
+          <w:color w:val="000000"/>
+          <w:sz w:val="20"/>
+          <w:szCs w:val="20"/>
+        </w:rPr>
+        <w:t>in the</w:t>
+      </w:r>
+      <w:r>
+        <w:rPr>
+          <w:rFonts w:ascii="Garamond" w:eastAsia="Garamond" w:hAnsi="Garamond" w:cs="Garamond"/>
+          <w:color w:val="000000"/>
+          <w:sz w:val="20"/>
+          <w:szCs w:val="20"/>
+        </w:rPr>
+        <w:t xml:space="preserve"> Fidelity Funds and Investment Operations </w:t>
+      </w:r>
+      <w:r>
+        <w:rPr>
+          <w:rFonts w:ascii="Garamond" w:eastAsia="Garamond" w:hAnsi="Garamond" w:cs="Garamond"/>
+          <w:color w:val="000000"/>
+          <w:sz w:val="20"/>
+          <w:szCs w:val="20"/>
+        </w:rPr>
+        <w:t xml:space="preserve">department specifically in the </w:t>
+      </w:r>
+      <w:r>
+        <w:rPr>
+          <w:rFonts w:ascii="Garamond" w:eastAsia="Garamond" w:hAnsi="Garamond" w:cs="Garamond"/>
+          <w:color w:val="000000"/>
+          <w:sz w:val="20"/>
+          <w:szCs w:val="20"/>
+        </w:rPr>
+        <w:t>Core Accounting team to support data flow validation, API integration, and migration testing for reporting workflows.</w:t>
+      </w:r>
+    </w:p>
+    <w:p>
+      <w:pPr>
+        <w:rPr>
+          <w:rFonts w:ascii="Garamond" w:eastAsia="Garamond" w:hAnsi="Garamond" w:cs="Garamond"/>
+          <w:sz w:val="20"/>
+          <w:szCs w:val="20"/>
+        </w:rPr>
+      </w:pPr>
+      <w:proofErr w:type="spellStart"/>
+      <w:r>
+        <w:rPr>
+          <w:rFonts w:ascii="Garamond" w:eastAsia="Garamond" w:hAnsi="Garamond" w:cs="Garamond"/>
+          <w:b/>
+          <w:sz w:val="20"/>
+          <w:szCs w:val="20"/>
+        </w:rPr>
+        <w:t>UltraRep</w:t>
+      </w:r>
+      <w:proofErr w:type="spellEnd"/>
+      <w:r>
+        <w:rPr>
+          <w:rFonts w:ascii="Garamond" w:eastAsia="Garamond" w:hAnsi="Garamond" w:cs="Garamond"/>
+          <w:b/>
+          <w:sz w:val="20"/>
+          <w:szCs w:val="20"/>
+        </w:rPr>
+        <w:t xml:space="preserve"> LLC</w:t>
+      </w:r>
+      <w:r>
+        <w:rPr>
+          <w:rFonts w:ascii="Garamond" w:eastAsia="Garamond" w:hAnsi="Garamond" w:cs="Garamond"/>
+          <w:sz w:val="20"/>
+          <w:szCs w:val="20"/>
+        </w:rPr>
+        <w:t xml:space="preserve">, </w:t>
+      </w:r>
+      <w:r>
+        <w:rPr>
+          <w:rFonts w:ascii="Garamond" w:eastAsia="Garamond" w:hAnsi="Garamond" w:cs="Garamond"/>
+          <w:sz w:val="20"/>
+          <w:szCs w:val="20"/>
+        </w:rPr>
+        <w:t xml:space="preserve">Backend </w:t>
+      </w:r>
+      <w:r>
+        <w:rPr>
+          <w:rFonts w:ascii="Garamond" w:eastAsia="Garamond" w:hAnsi="Garamond" w:cs="Garamond"/>
+          <w:iCs/>
+          <w:sz w:val="20"/>
+          <w:szCs w:val="20"/>
+        </w:rPr>
+        <w:t>Software Engineer</w:t>
+      </w:r>
+      <w:r>
+        <w:rPr>
+          <w:rFonts w:ascii="Garamond" w:eastAsia="Garamond" w:hAnsi="Garamond" w:cs="Garamond"/>
+          <w:iCs/>
+          <w:sz w:val="20"/>
+          <w:szCs w:val="20"/>
+        </w:rPr>
+        <w:t>ing</w:t>
+      </w:r>
+      <w:r>
+        <w:rPr>
+          <w:rFonts w:ascii="Garamond" w:eastAsia="Garamond" w:hAnsi="Garamond" w:cs="Garamond"/>
+          <w:iCs/>
+          <w:sz w:val="20"/>
+          <w:szCs w:val="20"/>
+        </w:rPr>
+        <w:t xml:space="preserve"> Intern</w:t>
+      </w:r>
+      <w:r>
+        <w:rPr>
+          <w:rFonts w:ascii="Garamond" w:eastAsia="Garamond" w:hAnsi="Garamond" w:cs="Garamond"/>
+          <w:iCs/>
+          <w:sz w:val="20"/>
+          <w:szCs w:val="20"/>
+        </w:rPr>
+        <w:t>,</w:t>
+      </w:r>
+      <w:r>
+        <w:rPr>
+          <w:rFonts w:ascii="Garamond" w:eastAsia="Garamond" w:hAnsi="Garamond" w:cs="Garamond"/>
+          <w:sz w:val="20"/>
+          <w:szCs w:val="20"/>
+        </w:rPr>
+        <w:t xml:space="preserve"> Remote</w:t>
+      </w:r>
+      <w:r>
+        <w:rPr>
+          <w:rFonts w:ascii="Garamond" w:eastAsia="Garamond" w:hAnsi="Garamond" w:cs="Garamond"/>
+          <w:sz w:val="20"/>
+          <w:szCs w:val="20"/>
+        </w:rPr>
+        <w:t xml:space="preserve"> (Java, OpenAI, APIs, R</w:t>
+      </w:r>
+      <w:r>
+        <w:rPr>
+          <w:rFonts w:ascii="Garamond" w:eastAsia="Garamond" w:hAnsi="Garamond" w:cs="Garamond"/>
+          <w:sz w:val="20"/>
+          <w:szCs w:val="20"/>
+        </w:rPr>
+        <w:t xml:space="preserve">edis) </w:t>
+      </w:r>
+      <w:r>
+        <w:rPr>
+          <w:rFonts w:ascii="Garamond" w:eastAsia="Garamond" w:hAnsi="Garamond" w:cs="Garamond"/>
+          <w:sz w:val="20"/>
+          <w:szCs w:val="20"/>
+        </w:rPr>
+        <w:t xml:space="preserve">                      </w:t>
+      </w:r>
+      <w:r>
+        <w:rPr>
+          <w:rFonts w:ascii="Garamond" w:eastAsia="Garamond" w:hAnsi="Garamond" w:cs="Garamond"/>
+          <w:sz w:val="20"/>
+          <w:szCs w:val="20"/>
+        </w:rPr>
+        <w:t xml:space="preserve">      </w:t>
+      </w:r>
+      <w:r>
+        <w:rPr>
+          <w:rFonts w:ascii="Garamond" w:eastAsia="Garamond" w:hAnsi="Garamond" w:cs="Garamond"/>
+          <w:sz w:val="20"/>
+          <w:szCs w:val="20"/>
+        </w:rPr>
+        <w:t xml:space="preserve"> </w:t>
+      </w:r>
+      <w:r>
+        <w:rPr>
+          <w:rFonts w:ascii="Garamond" w:eastAsia="Garamond" w:hAnsi="Garamond" w:cs="Garamond"/>
+          <w:sz w:val="20"/>
+          <w:szCs w:val="20"/>
+        </w:rPr>
+        <w:t xml:space="preserve">   </w:t>
+      </w:r>
+      <w:r>
+        <w:rPr>
+          <w:rFonts w:ascii="Garamond" w:eastAsia="Garamond" w:hAnsi="Garamond" w:cs="Garamond"/>
+          <w:sz w:val="20"/>
+          <w:szCs w:val="20"/>
+        </w:rPr>
+        <w:t xml:space="preserve">      </w:t>
+      </w:r>
+      <w:r>
+        <w:rPr>
+          <w:rFonts w:ascii="Garamond" w:eastAsia="Garamond" w:hAnsi="Garamond" w:cs="Garamond"/>
+          <w:sz w:val="2"/>
+          <w:szCs w:val="2"/>
+        </w:rPr>
+        <w:t xml:space="preserve">            </w:t>
+      </w:r>
+      <w:r>
+        <w:rPr>
+          <w:rFonts w:ascii="Garamond" w:eastAsia="Garamond" w:hAnsi="Garamond" w:cs="Garamond"/>
+          <w:sz w:val="2"/>
+          <w:szCs w:val="2"/>
+        </w:rPr>
+        <w:t xml:space="preserve">  </w:t>
+      </w:r>
+      <w:r>
+        <w:rPr>
+          <w:rFonts w:ascii="Garamond" w:eastAsia="Garamond" w:hAnsi="Garamond" w:cs="Garamond"/>
+          <w:sz w:val="20"/>
+          <w:szCs w:val="20"/>
+        </w:rPr>
+        <w:t>Jun</w:t>
+      </w:r>
+      <w:r>
+        <w:rPr>
+          <w:rFonts w:ascii="Garamond" w:eastAsia="Garamond" w:hAnsi="Garamond" w:cs="Garamond"/>
+          <w:sz w:val="20"/>
+          <w:szCs w:val="20"/>
+        </w:rPr>
+        <w:t xml:space="preserve"> 2025 </w:t>
+      </w:r>
+      <w:r>
+        <w:rPr>
+          <w:rFonts w:ascii="Garamond" w:eastAsia="Garamond" w:hAnsi="Garamond" w:cs="Garamond"/>
+          <w:sz w:val="20"/>
+          <w:szCs w:val="20"/>
+        </w:rPr>
+        <w:t>-</w:t>
+      </w:r>
+      <w:r>
+        <w:rPr>
+          <w:rFonts w:ascii="Garamond" w:eastAsia="Garamond" w:hAnsi="Garamond" w:cs="Garamond"/>
+          <w:sz w:val="20"/>
+          <w:szCs w:val="20"/>
+        </w:rPr>
+        <w:t xml:space="preserve"> </w:t>
+      </w:r>
+      <w:r>
+        <w:rPr>
+          <w:rFonts w:ascii="Garamond" w:eastAsia="Garamond" w:hAnsi="Garamond" w:cs="Garamond"/>
+          <w:sz w:val="20"/>
+          <w:szCs w:val="20"/>
+        </w:rPr>
+        <w:t>Aug</w:t>
+      </w:r>
+      <w:r>
+        <w:rPr>
+          <w:rFonts w:ascii="Garamond" w:eastAsia="Garamond" w:hAnsi="Garamond" w:cs="Garamond"/>
+          <w:sz w:val="20"/>
+          <w:szCs w:val="20"/>
+        </w:rPr>
+        <w:t xml:space="preserve"> 2025</w:t>
+      </w:r>
+      <w:r>
+        <w:rPr>
+          <w:rFonts w:ascii="Garamond" w:eastAsia="Garamond" w:hAnsi="Garamond" w:cs="Garamond"/>
+          <w:sz w:val="20"/>
+          <w:szCs w:val="20"/>
+        </w:rPr>
+        <w:t xml:space="preserve">                                                                                         </w:t>
+      </w:r>
+    </w:p>
+    <w:p>
+      <w:pPr>
+        <w:numPr>
+          <w:ilvl w:val="0"/>
+          <w:numId w:val="3"/>
+        </w:numPr>
+        <w:pBdr>
+          <w:top w:val="nil"/>
+          <w:left w:val="nil"/>
+          <w:bottom w:val="nil"/>
+          <w:right w:val="nil"/>
+          <w:between w:val="nil"/>
+        </w:pBdr>
+        <w:rPr>
+          <w:rFonts w:ascii="Garamond" w:eastAsia="Garamond" w:hAnsi="Garamond" w:cs="Garamond"/>
+          <w:color w:val="000000"/>
+          <w:sz w:val="20"/>
+          <w:szCs w:val="20"/>
+        </w:rPr>
+      </w:pPr>
+      <w:r>
+        <w:rPr>
+          <w:rFonts w:ascii="Garamond" w:eastAsia="Garamond" w:hAnsi="Garamond" w:cs="Garamond"/>
+          <w:color w:val="000000"/>
+          <w:sz w:val="20"/>
+          <w:szCs w:val="20"/>
+        </w:rPr>
+        <w:t>Built a REST endpoint that took conversation JSON as input, called the OpenAI API to generate coaching feedback, and returned a structured JSON response that the frontend could render reliably.</w:t>
+      </w:r>
+    </w:p>
+    <w:p>
+      <w:pPr>
+        <w:numPr>
+          <w:ilvl w:val="0"/>
+          <w:numId w:val="3"/>
+        </w:numPr>
+        <w:pBdr>
+          <w:top w:val="nil"/>
+          <w:left w:val="nil"/>
+          <w:bottom w:val="nil"/>
+          <w:right w:val="nil"/>
+          <w:between w:val="nil"/>
+        </w:pBdr>
+        <w:rPr>
+          <w:rFonts w:ascii="Garamond" w:eastAsia="Garamond" w:hAnsi="Garamond" w:cs="Garamond"/>
+          <w:color w:val="000000"/>
+          <w:sz w:val="20"/>
+          <w:szCs w:val="20"/>
+        </w:rPr>
+      </w:pPr>
+      <w:r>
+        <w:rPr>
+          <w:rFonts w:ascii="Garamond" w:eastAsia="Garamond" w:hAnsi="Garamond" w:cs="Garamond"/>
+          <w:color w:val="000000"/>
+          <w:sz w:val="20"/>
+          <w:szCs w:val="20"/>
+        </w:rPr>
+        <w:t>Added a strict response validation (required fields and type checks) and error handling for timeouts and malformed/unexpected response formats so the endpoint didn’t crash on bad upstream output</w:t>
+      </w:r>
+      <w:r>
+        <w:rPr>
+          <w:rFonts w:ascii="Garamond" w:eastAsia="Garamond" w:hAnsi="Garamond" w:cs="Garamond"/>
+          <w:color w:val="000000"/>
+          <w:sz w:val="20"/>
+          <w:szCs w:val="20"/>
+        </w:rPr>
+        <w:t>.</w:t>
+      </w:r>
+    </w:p>
+    <w:p>
+      <w:pPr>
+        <w:numPr>
+          <w:ilvl w:val="0"/>
+          <w:numId w:val="3"/>
+        </w:numPr>
+        <w:pBdr>
+          <w:top w:val="nil"/>
+          <w:left w:val="nil"/>
+          <w:bottom w:val="nil"/>
+          <w:right w:val="nil"/>
+          <w:between w:val="nil"/>
+        </w:pBdr>
+        <w:rPr>
+          <w:rFonts w:ascii="Garamond" w:eastAsia="Garamond" w:hAnsi="Garamond" w:cs="Garamond"/>
+          <w:sz w:val="20"/>
+          <w:szCs w:val="20"/>
+        </w:rPr>
+      </w:pPr>
+      <w:r>
+        <w:rPr>
+          <w:rFonts w:ascii="Garamond" w:eastAsia="Garamond" w:hAnsi="Garamond" w:cs="Garamond"/>
+          <w:color w:val="000000"/>
+          <w:sz w:val="20"/>
+          <w:szCs w:val="20"/>
+        </w:rPr>
+        <w:t>Wrote JUnit tests that mocked the OpenAI client across success and failure paths (timeout, non-200, missing fields) and asserted the endpoint returns a consistent fallback payload (‘status=degraded’, error_code, retryable, correlated id)</w:t>
+      </w:r>
+      <w:r>
+        <w:rPr>
+          <w:rFonts w:ascii="Garamond" w:eastAsia="Garamond" w:hAnsi="Garamond" w:cs="Garamond"/>
+          <w:color w:val="000000"/>
+          <w:sz w:val="20"/>
+          <w:szCs w:val="20"/>
+        </w:rPr>
+        <w:t>.</w:t>
+      </w:r>
+    </w:p>
+    <w:p>
+      <w:pPr>
+        <w:numPr>
+          <w:ilvl w:val="0"/>
+          <w:numId w:val="3"/>
+        </w:numPr>
+        <w:pBdr>
+          <w:top w:val="nil"/>
+          <w:left w:val="nil"/>
+          <w:bottom w:val="nil"/>
+          <w:right w:val="nil"/>
+          <w:between w:val="nil"/>
+        </w:pBdr>
+        <w:rPr>
+          <w:rFonts w:ascii="Garamond" w:eastAsia="Garamond" w:hAnsi="Garamond" w:cs="Garamond"/>
           <w:sz w:val="20"/>
           <w:szCs w:val="20"/>
         </w:rPr>
@@ -1792,6 +2281,217 @@
           <w:szCs w:val="20"/>
         </w:rPr>
         <w:t>Led early feasibility analysis for a museum-style interactive experience (targeting 1-3s latency, stable Earth pointing, and ~60-70W streaming power), supporting up to $2M in potential funding.</w:t>
+      </w:r>
+    </w:p>
+    <w:p>
+      <w:pPr>
+        <w:pBdr>
+          <w:bottom w:val="single" w:sz="4" w:space="1" w:color="000000"/>
+        </w:pBdr>
+        <w:rPr>
+          <w:rFonts w:ascii="Garamond" w:eastAsia="Garamond" w:hAnsi="Garamond" w:cs="Garamond"/>
+          <w:b/>
+          <w:sz w:val="20"/>
+          <w:szCs w:val="20"/>
+        </w:rPr>
+      </w:pPr>
+      <w:r>
+        <w:rPr>
+          <w:rFonts w:ascii="Garamond" w:eastAsia="Garamond" w:hAnsi="Garamond" w:cs="Garamond"/>
+          <w:b/>
+          <w:sz w:val="20"/>
+          <w:szCs w:val="20"/>
+        </w:rPr>
+        <w:t xml:space="preserve">RELEVANT </w:t>
+      </w:r>
+      <w:r>
+        <w:rPr>
+          <w:rFonts w:ascii="Garamond" w:eastAsia="Garamond" w:hAnsi="Garamond" w:cs="Garamond"/>
+          <w:b/>
+          <w:sz w:val="20"/>
+          <w:szCs w:val="20"/>
+        </w:rPr>
+        <w:t>PROJECTS</w:t>
+      </w:r>
+      <w:r>
+        <w:rPr>
+          <w:rFonts w:ascii="Garamond" w:eastAsia="Garamond" w:hAnsi="Garamond" w:cs="Garamond"/>
+          <w:sz w:val="20"/>
+          <w:szCs w:val="20"/>
+        </w:rPr>
+        <w:tab/>
+      </w:r>
+      <w:r>
+        <w:rPr>
+          <w:rFonts w:ascii="Garamond" w:eastAsia="Garamond" w:hAnsi="Garamond" w:cs="Garamond"/>
+          <w:sz w:val="20"/>
+          <w:szCs w:val="20"/>
+        </w:rPr>
+        <w:tab/>
+      </w:r>
+      <w:r>
+        <w:rPr>
+          <w:rFonts w:ascii="Garamond" w:eastAsia="Garamond" w:hAnsi="Garamond" w:cs="Garamond"/>
+          <w:sz w:val="20"/>
+          <w:szCs w:val="20"/>
+        </w:rPr>
+        <w:tab/>
+      </w:r>
+      <w:r>
+        <w:rPr>
+          <w:rFonts w:ascii="Garamond" w:eastAsia="Garamond" w:hAnsi="Garamond" w:cs="Garamond"/>
+          <w:sz w:val="20"/>
+          <w:szCs w:val="20"/>
+        </w:rPr>
+        <w:tab/>
+        <w:t xml:space="preserve">      </w:t>
+      </w:r>
+    </w:p>
+    <w:p>
+      <w:pPr>
+        <w:pBdr>
+          <w:top w:val="nil"/>
+          <w:left w:val="nil"/>
+          <w:bottom w:val="nil"/>
+          <w:right w:val="nil"/>
+          <w:between w:val="nil"/>
+        </w:pBdr>
+        <w:rPr>
+          <w:rFonts w:ascii="Garamond" w:hAnsi="Garamond"/>
+          <w:sz w:val="20"/>
+          <w:szCs w:val="20"/>
+        </w:rPr>
+      </w:pPr>
+      <w:r>
+        <w:rPr>
+          <w:rFonts w:ascii="Garamond" w:eastAsia="Garamond" w:hAnsi="Garamond" w:cs="Garamond"/>
+          <w:b/>
+          <w:bCs/>
+          <w:color w:val="000000"/>
+          <w:sz w:val="20"/>
+          <w:szCs w:val="20"/>
+        </w:rPr>
+        <w:t>UGA+Athens-Clarke County Water Treatment Facility</w:t>
+      </w:r>
+      <w:r>
+        <w:rPr>
+          <w:rFonts w:ascii="Garamond" w:eastAsia="Garamond" w:hAnsi="Garamond" w:cs="Garamond"/>
+          <w:color w:val="000000"/>
+          <w:sz w:val="20"/>
+          <w:szCs w:val="20"/>
+        </w:rPr>
+        <w:t xml:space="preserve">, AI@UGA Software Engineer, Athens, GA (Sensor ML)  </w:t>
+      </w:r>
+      <w:r>
+        <w:rPr>
+          <w:rFonts w:ascii="Garamond" w:eastAsia="Garamond" w:hAnsi="Garamond" w:cs="Garamond"/>
+          <w:color w:val="000000"/>
+          <w:sz w:val="2"/>
+          <w:szCs w:val="2"/>
+        </w:rPr>
+        <w:t xml:space="preserve">                               </w:t>
+      </w:r>
+      <w:r>
+        <w:rPr>
+          <w:rFonts w:ascii="Garamond" w:eastAsia="Garamond" w:hAnsi="Garamond" w:cs="Garamond"/>
+          <w:color w:val="000000"/>
+          <w:sz w:val="20"/>
+          <w:szCs w:val="20"/>
+        </w:rPr>
+        <w:t>Apr 2025 - Present</w:t>
+      </w:r>
+    </w:p>
+    <w:p>
+      <w:pPr>
+        <w:pStyle w:val="ListParagraph"/>
+        <w:numPr>
+          <w:ilvl w:val="0"/>
+          <w:numId w:val="23"/>
+        </w:numPr>
+        <w:pBdr>
+          <w:top w:val="nil"/>
+          <w:left w:val="nil"/>
+          <w:bottom w:val="nil"/>
+          <w:right w:val="nil"/>
+          <w:between w:val="nil"/>
+        </w:pBdr>
+        <w:rPr>
+          <w:rFonts w:ascii="Garamond" w:eastAsia="Garamond" w:hAnsi="Garamond" w:cs="Garamond"/>
+          <w:color w:val="000000"/>
+          <w:sz w:val="20"/>
+          <w:szCs w:val="20"/>
+        </w:rPr>
+      </w:pPr>
+      <w:r>
+        <w:rPr>
+          <w:rFonts w:ascii="Garamond" w:eastAsia="Garamond" w:hAnsi="Garamond" w:cs="Garamond"/>
+          <w:color w:val="000000"/>
+          <w:sz w:val="20"/>
+          <w:szCs w:val="20"/>
+        </w:rPr>
+        <w:t>Built a feature pipeline for dissolved oxygen prediction from multivariate sensor streams, processing &gt;1M readings/day using SQL windowing plus real-time aggregation.</w:t>
+      </w:r>
+    </w:p>
+    <w:p>
+      <w:pPr>
+        <w:pStyle w:val="ListParagraph"/>
+        <w:numPr>
+          <w:ilvl w:val="0"/>
+          <w:numId w:val="23"/>
+        </w:numPr>
+        <w:pBdr>
+          <w:top w:val="nil"/>
+          <w:left w:val="nil"/>
+          <w:bottom w:val="nil"/>
+          <w:right w:val="nil"/>
+          <w:between w:val="nil"/>
+        </w:pBdr>
+        <w:rPr>
+          <w:rFonts w:ascii="Garamond" w:eastAsia="Garamond" w:hAnsi="Garamond" w:cs="Garamond"/>
+          <w:color w:val="000000"/>
+          <w:sz w:val="20"/>
+          <w:szCs w:val="20"/>
+        </w:rPr>
+      </w:pPr>
+      <w:r>
+        <w:rPr>
+          <w:rFonts w:ascii="Garamond" w:eastAsia="Garamond" w:hAnsi="Garamond" w:cs="Garamond"/>
+          <w:color w:val="000000"/>
+          <w:sz w:val="20"/>
+          <w:szCs w:val="20"/>
+        </w:rPr>
+        <w:t>Tuned models for low-power edge devices using quantization and pruning to reduce inferencing time on microcontrollers.</w:t>
+      </w:r>
+    </w:p>
+    <w:p>
+      <w:pPr>
+        <w:pStyle w:val="ListParagraph"/>
+        <w:numPr>
+          <w:ilvl w:val="0"/>
+          <w:numId w:val="23"/>
+        </w:numPr>
+        <w:pBdr>
+          <w:top w:val="nil"/>
+          <w:left w:val="nil"/>
+          <w:bottom w:val="nil"/>
+          <w:right w:val="nil"/>
+          <w:between w:val="nil"/>
+        </w:pBdr>
+        <w:rPr>
+          <w:rFonts w:ascii="Garamond" w:eastAsia="Garamond" w:hAnsi="Garamond" w:cs="Garamond"/>
+          <w:color w:val="000000"/>
+          <w:sz w:val="20"/>
+          <w:szCs w:val="20"/>
+        </w:rPr>
+      </w:pPr>
+      <w:r>
+        <w:rPr>
+          <w:rFonts w:ascii="Garamond" w:eastAsia="Garamond" w:hAnsi="Garamond" w:cs="Garamond"/>
+          <w:color w:val="000000"/>
+          <w:sz w:val="20"/>
+          <w:szCs w:val="20"/>
+        </w:rPr>
+        <w:t>Added data quality checks and anomaly triggers so predictions stayed stable during sensor noise and missing transmissions.</w:t>
       </w:r>
     </w:p>
     <w:p>
@@ -1935,440 +2635,6 @@
     </w:p>
     <w:p>
       <w:pPr>
-        <w:pBdr>
-          <w:top w:val="nil"/>
-          <w:left w:val="nil"/>
-          <w:bottom w:val="nil"/>
-          <w:right w:val="nil"/>
-          <w:between w:val="nil"/>
-        </w:pBdr>
-        <w:rPr>
-          <w:rFonts w:ascii="Garamond" w:hAnsi="Garamond"/>
-          <w:sz w:val="20"/>
-          <w:szCs w:val="20"/>
-        </w:rPr>
-      </w:pPr>
-      <w:r>
-        <w:rPr>
-          <w:rFonts w:ascii="Garamond" w:eastAsia="Garamond" w:hAnsi="Garamond" w:cs="Garamond"/>
-          <w:b/>
-          <w:bCs/>
-          <w:color w:val="000000"/>
-          <w:sz w:val="20"/>
-          <w:szCs w:val="20"/>
-        </w:rPr>
-        <w:t>UGA+Athens-Clarke County Water Treatment Facility</w:t>
-      </w:r>
-      <w:r>
-        <w:rPr>
-          <w:rFonts w:ascii="Garamond" w:eastAsia="Garamond" w:hAnsi="Garamond" w:cs="Garamond"/>
-          <w:color w:val="000000"/>
-          <w:sz w:val="20"/>
-          <w:szCs w:val="20"/>
-        </w:rPr>
-        <w:t xml:space="preserve">, AI@UGA Software Engineer, Athens, GA (Sensor ML)  </w:t>
-      </w:r>
-      <w:r>
-        <w:rPr>
-          <w:rFonts w:ascii="Garamond" w:eastAsia="Garamond" w:hAnsi="Garamond" w:cs="Garamond"/>
-          <w:color w:val="000000"/>
-          <w:sz w:val="2"/>
-          <w:szCs w:val="2"/>
-        </w:rPr>
-        <w:t xml:space="preserve">                               </w:t>
-      </w:r>
-      <w:r>
-        <w:rPr>
-          <w:rFonts w:ascii="Garamond" w:eastAsia="Garamond" w:hAnsi="Garamond" w:cs="Garamond"/>
-          <w:color w:val="000000"/>
-          <w:sz w:val="20"/>
-          <w:szCs w:val="20"/>
-        </w:rPr>
-        <w:t>Apr 2025 - Present</w:t>
-      </w:r>
-    </w:p>
-    <w:p>
-      <w:pPr>
-        <w:pStyle w:val="ListParagraph"/>
-        <w:numPr>
-          <w:ilvl w:val="0"/>
-          <w:numId w:val="23"/>
-        </w:numPr>
-        <w:pBdr>
-          <w:top w:val="nil"/>
-          <w:left w:val="nil"/>
-          <w:bottom w:val="nil"/>
-          <w:right w:val="nil"/>
-          <w:between w:val="nil"/>
-        </w:pBdr>
-        <w:rPr>
-          <w:rFonts w:ascii="Garamond" w:eastAsia="Garamond" w:hAnsi="Garamond" w:cs="Garamond"/>
-          <w:color w:val="000000"/>
-          <w:sz w:val="20"/>
-          <w:szCs w:val="20"/>
-        </w:rPr>
-      </w:pPr>
-      <w:r>
-        <w:rPr>
-          <w:rFonts w:ascii="Garamond" w:eastAsia="Garamond" w:hAnsi="Garamond" w:cs="Garamond"/>
-          <w:color w:val="000000"/>
-          <w:sz w:val="20"/>
-          <w:szCs w:val="20"/>
-        </w:rPr>
-        <w:t>Built a feature pipeline for dissolved oxygen prediction from multivariate sensor streams, processing &gt;1M readings/day using SQL windowing plus real-time aggregation.</w:t>
-      </w:r>
-    </w:p>
-    <w:p>
-      <w:pPr>
-        <w:pStyle w:val="ListParagraph"/>
-        <w:numPr>
-          <w:ilvl w:val="0"/>
-          <w:numId w:val="23"/>
-        </w:numPr>
-        <w:pBdr>
-          <w:top w:val="nil"/>
-          <w:left w:val="nil"/>
-          <w:bottom w:val="nil"/>
-          <w:right w:val="nil"/>
-          <w:between w:val="nil"/>
-        </w:pBdr>
-        <w:rPr>
-          <w:rFonts w:ascii="Garamond" w:eastAsia="Garamond" w:hAnsi="Garamond" w:cs="Garamond"/>
-          <w:color w:val="000000"/>
-          <w:sz w:val="20"/>
-          <w:szCs w:val="20"/>
-        </w:rPr>
-      </w:pPr>
-      <w:r>
-        <w:rPr>
-          <w:rFonts w:ascii="Garamond" w:eastAsia="Garamond" w:hAnsi="Garamond" w:cs="Garamond"/>
-          <w:color w:val="000000"/>
-          <w:sz w:val="20"/>
-          <w:szCs w:val="20"/>
-        </w:rPr>
-        <w:t>Tuned models for low-power edge devices using quantization and pruning to reduce inferencing time on microcontrollers.</w:t>
-      </w:r>
-    </w:p>
-    <w:p>
-      <w:pPr>
-        <w:pStyle w:val="ListParagraph"/>
-        <w:numPr>
-          <w:ilvl w:val="0"/>
-          <w:numId w:val="23"/>
-        </w:numPr>
-        <w:pBdr>
-          <w:top w:val="nil"/>
-          <w:left w:val="nil"/>
-          <w:bottom w:val="nil"/>
-          <w:right w:val="nil"/>
-          <w:between w:val="nil"/>
-        </w:pBdr>
-        <w:rPr>
-          <w:rFonts w:ascii="Garamond" w:eastAsia="Garamond" w:hAnsi="Garamond" w:cs="Garamond"/>
-          <w:color w:val="000000"/>
-          <w:sz w:val="20"/>
-          <w:szCs w:val="20"/>
-        </w:rPr>
-      </w:pPr>
-      <w:r>
-        <w:rPr>
-          <w:rFonts w:ascii="Garamond" w:eastAsia="Garamond" w:hAnsi="Garamond" w:cs="Garamond"/>
-          <w:color w:val="000000"/>
-          <w:sz w:val="20"/>
-          <w:szCs w:val="20"/>
-        </w:rPr>
-        <w:t>Added data quality checks and anomaly triggers so predictions stayed stable during sensor noise and missing transmissions.</w:t>
-      </w:r>
-    </w:p>
-    <w:p>
-      <w:pPr>
-        <w:rPr>
-          <w:rFonts w:ascii="Garamond" w:eastAsia="Garamond" w:hAnsi="Garamond" w:cs="Garamond"/>
-          <w:sz w:val="20"/>
-          <w:szCs w:val="20"/>
-        </w:rPr>
-      </w:pPr>
-      <w:r>
-        <w:rPr>
-          <w:rFonts w:ascii="Garamond" w:eastAsia="Garamond" w:hAnsi="Garamond" w:cs="Garamond"/>
-          <w:b/>
-          <w:sz w:val="20"/>
-          <w:szCs w:val="20"/>
-        </w:rPr>
-        <w:t>SmartPhoneTrucke</w:t>
-      </w:r>
-      <w:r>
-        <w:rPr>
-          <w:rFonts w:ascii="Garamond" w:eastAsia="Garamond" w:hAnsi="Garamond" w:cs="Garamond"/>
-          <w:b/>
-          <w:sz w:val="20"/>
-          <w:szCs w:val="20"/>
-        </w:rPr>
-        <w:t>r</w:t>
-      </w:r>
-      <w:r>
-        <w:rPr>
-          <w:rFonts w:ascii="Garamond" w:eastAsia="Garamond" w:hAnsi="Garamond" w:cs="Garamond"/>
-          <w:b/>
-          <w:sz w:val="20"/>
-          <w:szCs w:val="20"/>
-        </w:rPr>
-        <w:t xml:space="preserve"> LLC</w:t>
-      </w:r>
-      <w:r>
-        <w:rPr>
-          <w:rFonts w:ascii="Garamond" w:eastAsia="Garamond" w:hAnsi="Garamond" w:cs="Garamond"/>
-          <w:sz w:val="20"/>
-          <w:szCs w:val="20"/>
-        </w:rPr>
-        <w:t xml:space="preserve">, </w:t>
-      </w:r>
-      <w:r>
-        <w:rPr>
-          <w:rFonts w:ascii="Garamond" w:eastAsia="Garamond" w:hAnsi="Garamond" w:cs="Garamond"/>
-          <w:iCs/>
-          <w:sz w:val="20"/>
-          <w:szCs w:val="20"/>
-        </w:rPr>
-        <w:t>Software Development Intern,</w:t>
-      </w:r>
-      <w:r>
-        <w:rPr>
-          <w:rFonts w:ascii="Garamond" w:eastAsia="Garamond" w:hAnsi="Garamond" w:cs="Garamond"/>
-          <w:sz w:val="20"/>
-          <w:szCs w:val="20"/>
-        </w:rPr>
-        <w:t xml:space="preserve"> Suwanee, G</w:t>
-      </w:r>
-      <w:r>
-        <w:rPr>
-          <w:rFonts w:ascii="Garamond" w:eastAsia="Garamond" w:hAnsi="Garamond" w:cs="Garamond"/>
-          <w:sz w:val="20"/>
-          <w:szCs w:val="20"/>
-        </w:rPr>
-        <w:t>A (ReactJS, JavaScript, HTML</w:t>
-      </w:r>
-      <w:r>
-        <w:rPr>
-          <w:rFonts w:ascii="Garamond" w:eastAsia="Garamond" w:hAnsi="Garamond" w:cs="Garamond"/>
-          <w:sz w:val="20"/>
-          <w:szCs w:val="20"/>
-        </w:rPr>
-        <w:t>/</w:t>
-      </w:r>
-      <w:r>
-        <w:rPr>
-          <w:rFonts w:ascii="Garamond" w:eastAsia="Garamond" w:hAnsi="Garamond" w:cs="Garamond"/>
-          <w:sz w:val="20"/>
-          <w:szCs w:val="20"/>
-        </w:rPr>
-        <w:t>CSS)</w:t>
-      </w:r>
-      <w:r>
-        <w:rPr>
-          <w:rFonts w:ascii="Garamond" w:eastAsia="Garamond" w:hAnsi="Garamond" w:cs="Garamond"/>
-          <w:sz w:val="20"/>
-          <w:szCs w:val="20"/>
-        </w:rPr>
-        <w:tab/>
-      </w:r>
-      <w:r>
-        <w:rPr>
-          <w:rFonts w:ascii="Garamond" w:eastAsia="Garamond" w:hAnsi="Garamond" w:cs="Garamond"/>
-          <w:sz w:val="20"/>
-          <w:szCs w:val="20"/>
-        </w:rPr>
-        <w:t xml:space="preserve">          </w:t>
-      </w:r>
-      <w:r>
-        <w:rPr>
-          <w:rFonts w:ascii="Garamond" w:eastAsia="Garamond" w:hAnsi="Garamond" w:cs="Garamond"/>
-          <w:sz w:val="2"/>
-          <w:szCs w:val="2"/>
-        </w:rPr>
-        <w:t xml:space="preserve">     </w:t>
-      </w:r>
-      <w:r>
-        <w:rPr>
-          <w:rFonts w:ascii="Garamond" w:eastAsia="Garamond" w:hAnsi="Garamond" w:cs="Garamond"/>
-          <w:sz w:val="20"/>
-          <w:szCs w:val="20"/>
-        </w:rPr>
-        <w:t>Aug 2023 - Feb 2024</w:t>
-      </w:r>
-      <w:r>
-        <w:rPr>
-          <w:rFonts w:ascii="Garamond" w:eastAsia="Garamond" w:hAnsi="Garamond" w:cs="Garamond"/>
-          <w:sz w:val="20"/>
-          <w:szCs w:val="20"/>
-        </w:rPr>
-        <w:t xml:space="preserve">  </w:t>
-      </w:r>
-      <w:r>
-        <w:rPr>
-          <w:rFonts w:ascii="Garamond" w:eastAsia="Garamond" w:hAnsi="Garamond" w:cs="Garamond"/>
-          <w:sz w:val="20"/>
-          <w:szCs w:val="20"/>
-        </w:rPr>
-        <w:t xml:space="preserve"> </w:t>
-      </w:r>
-    </w:p>
-    <w:p>
-      <w:pPr>
-        <w:numPr>
-          <w:ilvl w:val="0"/>
-          <w:numId w:val="3"/>
-        </w:numPr>
-        <w:pBdr>
-          <w:top w:val="nil"/>
-          <w:left w:val="nil"/>
-          <w:bottom w:val="nil"/>
-          <w:right w:val="nil"/>
-          <w:between w:val="nil"/>
-        </w:pBdr>
-        <w:rPr>
-          <w:rFonts w:ascii="Garamond" w:eastAsia="Garamond" w:hAnsi="Garamond" w:cs="Garamond"/>
-          <w:color w:val="000000"/>
-          <w:sz w:val="20"/>
-          <w:szCs w:val="20"/>
-        </w:rPr>
-      </w:pPr>
-      <w:r>
-        <w:rPr>
-          <w:rFonts w:ascii="Garamond" w:eastAsia="Garamond" w:hAnsi="Garamond" w:cs="Garamond"/>
-          <w:color w:val="000000"/>
-          <w:sz w:val="20"/>
-          <w:szCs w:val="20"/>
-        </w:rPr>
-        <w:t>Stabilized three production React apps by profiling render performance, removing UI blocking work, and fixing 300+ frontend exceptions.</w:t>
-      </w:r>
-    </w:p>
-    <w:p>
-      <w:pPr>
-        <w:numPr>
-          <w:ilvl w:val="0"/>
-          <w:numId w:val="3"/>
-        </w:numPr>
-        <w:pBdr>
-          <w:top w:val="nil"/>
-          <w:left w:val="nil"/>
-          <w:bottom w:val="nil"/>
-          <w:right w:val="nil"/>
-          <w:between w:val="nil"/>
-        </w:pBdr>
-        <w:rPr>
-          <w:rFonts w:ascii="Garamond" w:eastAsia="Garamond" w:hAnsi="Garamond" w:cs="Garamond"/>
-          <w:color w:val="000000"/>
-          <w:sz w:val="20"/>
-          <w:szCs w:val="20"/>
-        </w:rPr>
-      </w:pPr>
-      <w:r>
-        <w:rPr>
-          <w:rFonts w:ascii="Garamond" w:eastAsia="Garamond" w:hAnsi="Garamond" w:cs="Garamond"/>
-          <w:color w:val="000000"/>
-          <w:sz w:val="20"/>
-          <w:szCs w:val="20"/>
-        </w:rPr>
-        <w:t>Helped design the mobile logistics app structure using modular components and clear domain boundaries so features could ship faster with fewer rewrites.</w:t>
-      </w:r>
-    </w:p>
-    <w:p>
-      <w:pPr>
-        <w:numPr>
-          <w:ilvl w:val="0"/>
-          <w:numId w:val="3"/>
-        </w:numPr>
-        <w:pBdr>
-          <w:top w:val="nil"/>
-          <w:left w:val="nil"/>
-          <w:bottom w:val="nil"/>
-          <w:right w:val="nil"/>
-          <w:between w:val="nil"/>
-        </w:pBdr>
-        <w:rPr>
-          <w:rFonts w:ascii="Garamond" w:eastAsia="Garamond" w:hAnsi="Garamond" w:cs="Garamond"/>
-          <w:color w:val="000000"/>
-          <w:sz w:val="20"/>
-          <w:szCs w:val="20"/>
-        </w:rPr>
-      </w:pPr>
-      <w:r>
-        <w:rPr>
-          <w:rFonts w:ascii="Garamond" w:eastAsia="Garamond" w:hAnsi="Garamond" w:cs="Garamond"/>
-          <w:color w:val="000000"/>
-          <w:sz w:val="20"/>
-          <w:szCs w:val="20"/>
-        </w:rPr>
-        <w:t>Improved load performance by cleaning up the build and asset pipeline, reducing unnecessary JS and raising Lighthouse scores by 30%+, especially on slow mobile networks.</w:t>
-      </w:r>
-    </w:p>
-    <w:p>
-      <w:pPr>
-        <w:pBdr>
-          <w:bottom w:val="single" w:sz="4" w:space="1" w:color="000000"/>
-        </w:pBdr>
-        <w:rPr>
-          <w:rFonts w:ascii="Garamond" w:eastAsia="Garamond" w:hAnsi="Garamond" w:cs="Garamond"/>
-          <w:b/>
-          <w:sz w:val="20"/>
-          <w:szCs w:val="20"/>
-        </w:rPr>
-      </w:pPr>
-      <w:r>
-        <w:rPr>
-          <w:rFonts w:ascii="Garamond" w:eastAsia="Garamond" w:hAnsi="Garamond" w:cs="Garamond"/>
-          <w:b/>
-          <w:sz w:val="20"/>
-          <w:szCs w:val="20"/>
-        </w:rPr>
-        <w:t xml:space="preserve">RELEVANT </w:t>
-      </w:r>
-      <w:r>
-        <w:rPr>
-          <w:rFonts w:ascii="Garamond" w:eastAsia="Garamond" w:hAnsi="Garamond" w:cs="Garamond"/>
-          <w:b/>
-          <w:sz w:val="20"/>
-          <w:szCs w:val="20"/>
-        </w:rPr>
-        <w:t>PROJECTS</w:t>
-      </w:r>
-      <w:r>
-        <w:rPr>
-          <w:rFonts w:ascii="Garamond" w:eastAsia="Garamond" w:hAnsi="Garamond" w:cs="Garamond"/>
-          <w:sz w:val="20"/>
-          <w:szCs w:val="20"/>
-        </w:rPr>
-        <w:tab/>
-      </w:r>
-      <w:r>
-        <w:rPr>
-          <w:rFonts w:ascii="Garamond" w:eastAsia="Garamond" w:hAnsi="Garamond" w:cs="Garamond"/>
-          <w:sz w:val="20"/>
-          <w:szCs w:val="20"/>
-        </w:rPr>
-        <w:tab/>
-      </w:r>
-      <w:r>
-        <w:rPr>
-          <w:rFonts w:ascii="Garamond" w:eastAsia="Garamond" w:hAnsi="Garamond" w:cs="Garamond"/>
-          <w:sz w:val="20"/>
-          <w:szCs w:val="20"/>
-        </w:rPr>
-        <w:tab/>
-      </w:r>
-      <w:r>
-        <w:rPr>
-          <w:rFonts w:ascii="Garamond" w:eastAsia="Garamond" w:hAnsi="Garamond" w:cs="Garamond"/>
-          <w:sz w:val="20"/>
-          <w:szCs w:val="20"/>
-        </w:rPr>
-        <w:tab/>
-        <w:t xml:space="preserve">      </w:t>
-      </w:r>
-    </w:p>
-    <w:p>
-      <w:pPr>
         <w:rPr>
           <w:rFonts w:ascii="Garamond" w:eastAsia="Garamond" w:hAnsi="Garamond" w:cs="Garamond"/>
           <w:sz w:val="20"/>
@@ -2743,7 +3009,16 @@
           <w:sz w:val="20"/>
           <w:szCs w:val="20"/>
         </w:rPr>
-        <w:t>Jan 2025</w:t>
+        <w:t>Jan 202</w:t>
+      </w:r>
+      <w:r>
+        <w:rPr>
+          <w:rFonts w:ascii="Garamond" w:eastAsia="Garamond" w:hAnsi="Garamond" w:cs="Garamond"/>
+          <w:color w:val="000000"/>
+          <w:sz w:val="20"/>
+          <w:szCs w:val="20"/>
+        </w:rPr>
+        <w:t>6</w:t>
       </w:r>
     </w:p>
     <w:p>
@@ -3030,6 +3305,15 @@
           <w:szCs w:val="20"/>
         </w:rPr>
         <w:t>-</w:t>
+      </w:r>
+      <w:r>
+        <w:rPr>
+          <w:rFonts w:ascii="Garamond" w:eastAsia="Garamond" w:hAnsi="Garamond" w:cs="Garamond"/>
+          <w:color w:val="000000"/>
+          <w:sz w:val="20"/>
+          <w:szCs w:val="20"/>
+        </w:rPr>
+        <w:t>l</w:t>
       </w:r>
       <w:r>
         <w:rPr>

</xml_diff>

<commit_message>
Updated Resume and Website 06/24
</commit_message>
<xml_diff>
--- a/AnishBandaResume.docx
+++ b/AnishBandaResume.docx
@@ -1237,110 +1237,7 @@
           <w:sz w:val="20"/>
           <w:szCs w:val="20"/>
         </w:rPr>
-        <w:t>Building the</w:t>
-      </w:r>
-      <w:r>
-        <w:rPr>
-          <w:rFonts w:ascii="Garamond" w:eastAsia="Garamond" w:hAnsi="Garamond" w:cs="Garamond"/>
-          <w:color w:val="000000"/>
-          <w:sz w:val="20"/>
-          <w:szCs w:val="20"/>
-        </w:rPr>
-        <w:t xml:space="preserve"> APEX Reporting Engine for FFIO Core Accounting which executes Spectra queries </w:t>
-      </w:r>
-      <w:r>
-        <w:rPr>
-          <w:rFonts w:ascii="Garamond" w:eastAsia="Garamond" w:hAnsi="Garamond" w:cs="Garamond"/>
-          <w:color w:val="000000"/>
-          <w:sz w:val="20"/>
-          <w:szCs w:val="20"/>
-        </w:rPr>
-        <w:t>to</w:t>
-      </w:r>
-      <w:r>
-        <w:rPr>
-          <w:rFonts w:ascii="Garamond" w:eastAsia="Garamond" w:hAnsi="Garamond" w:cs="Garamond"/>
-          <w:color w:val="000000"/>
-          <w:sz w:val="20"/>
-          <w:szCs w:val="20"/>
-        </w:rPr>
-        <w:t xml:space="preserve"> surface fund accounting data from </w:t>
-      </w:r>
-      <w:proofErr w:type="spellStart"/>
-      <w:r>
-        <w:rPr>
-          <w:rFonts w:ascii="Garamond" w:eastAsia="Garamond" w:hAnsi="Garamond" w:cs="Garamond"/>
-          <w:color w:val="000000"/>
-          <w:sz w:val="20"/>
-          <w:szCs w:val="20"/>
-        </w:rPr>
-        <w:t>InvestOne</w:t>
-      </w:r>
-      <w:proofErr w:type="spellEnd"/>
-      <w:r>
-        <w:rPr>
-          <w:rFonts w:ascii="Garamond" w:eastAsia="Garamond" w:hAnsi="Garamond" w:cs="Garamond"/>
-          <w:color w:val="000000"/>
-          <w:sz w:val="20"/>
-          <w:szCs w:val="20"/>
-        </w:rPr>
-        <w:t xml:space="preserve"> </w:t>
-      </w:r>
-      <w:r>
-        <w:rPr>
-          <w:rFonts w:ascii="Garamond" w:eastAsia="Garamond" w:hAnsi="Garamond" w:cs="Garamond"/>
-          <w:color w:val="000000"/>
-          <w:sz w:val="20"/>
-          <w:szCs w:val="20"/>
-        </w:rPr>
-        <w:t>and drive</w:t>
-      </w:r>
-      <w:r>
-        <w:rPr>
-          <w:rFonts w:ascii="Garamond" w:eastAsia="Garamond" w:hAnsi="Garamond" w:cs="Garamond"/>
-          <w:color w:val="000000"/>
-          <w:sz w:val="20"/>
-          <w:szCs w:val="20"/>
-        </w:rPr>
-        <w:t xml:space="preserve"> migrat</w:t>
-      </w:r>
-      <w:r>
-        <w:rPr>
-          <w:rFonts w:ascii="Garamond" w:eastAsia="Garamond" w:hAnsi="Garamond" w:cs="Garamond"/>
-          <w:color w:val="000000"/>
-          <w:sz w:val="20"/>
-          <w:szCs w:val="20"/>
-        </w:rPr>
-        <w:t>ion</w:t>
-      </w:r>
-      <w:r>
-        <w:rPr>
-          <w:rFonts w:ascii="Garamond" w:eastAsia="Garamond" w:hAnsi="Garamond" w:cs="Garamond"/>
-          <w:color w:val="000000"/>
-          <w:sz w:val="20"/>
-          <w:szCs w:val="20"/>
-        </w:rPr>
-        <w:t xml:space="preserve"> to </w:t>
-      </w:r>
-      <w:proofErr w:type="spellStart"/>
-      <w:r>
-        <w:rPr>
-          <w:rFonts w:ascii="Garamond" w:eastAsia="Garamond" w:hAnsi="Garamond" w:cs="Garamond"/>
-          <w:color w:val="000000"/>
-          <w:sz w:val="20"/>
-          <w:szCs w:val="20"/>
-        </w:rPr>
-        <w:t>HedgeServ</w:t>
-      </w:r>
-      <w:proofErr w:type="spellEnd"/>
-      <w:r>
-        <w:rPr>
-          <w:rFonts w:ascii="Garamond" w:eastAsia="Garamond" w:hAnsi="Garamond" w:cs="Garamond"/>
-          <w:color w:val="000000"/>
-          <w:sz w:val="20"/>
-          <w:szCs w:val="20"/>
-        </w:rPr>
-        <w:t>.</w:t>
+        <w:t>Working on the Core Accounting team within Fidelity Funds and Investment Operations department, helping validate data flows, integrate APIs, and test reporting workflows as the migration progresses.</w:t>
       </w:r>
     </w:p>
     <w:p>
@@ -1370,52 +1267,128 @@
           <w:sz w:val="20"/>
           <w:szCs w:val="20"/>
         </w:rPr>
-        <w:t>Migrat</w:t>
-      </w:r>
-      <w:r>
-        <w:rPr>
-          <w:rFonts w:ascii="Garamond" w:eastAsia="Garamond" w:hAnsi="Garamond" w:cs="Garamond"/>
-          <w:color w:val="000000"/>
-          <w:sz w:val="20"/>
-          <w:szCs w:val="20"/>
-        </w:rPr>
-        <w:t>ed</w:t>
-      </w:r>
-      <w:r>
-        <w:rPr>
-          <w:rFonts w:ascii="Garamond" w:eastAsia="Garamond" w:hAnsi="Garamond" w:cs="Garamond"/>
-          <w:color w:val="000000"/>
-          <w:sz w:val="20"/>
-          <w:szCs w:val="20"/>
-        </w:rPr>
-        <w:t xml:space="preserve"> EDWAM service logic for WAM/WAL calculations into APEX, consolidating </w:t>
-      </w:r>
-      <w:r>
-        <w:rPr>
-          <w:rFonts w:ascii="Garamond" w:eastAsia="Garamond" w:hAnsi="Garamond" w:cs="Garamond"/>
-          <w:color w:val="000000"/>
-          <w:sz w:val="20"/>
-          <w:szCs w:val="20"/>
-        </w:rPr>
-        <w:t>core</w:t>
-      </w:r>
-      <w:r>
-        <w:rPr>
-          <w:rFonts w:ascii="Garamond" w:eastAsia="Garamond" w:hAnsi="Garamond" w:cs="Garamond"/>
-          <w:color w:val="000000"/>
-          <w:sz w:val="20"/>
-          <w:szCs w:val="20"/>
-        </w:rPr>
-        <w:t xml:space="preserve"> accounting functionality into the main platform</w:t>
-      </w:r>
-      <w:r>
-        <w:rPr>
-          <w:rFonts w:ascii="Garamond" w:eastAsia="Garamond" w:hAnsi="Garamond" w:cs="Garamond"/>
-          <w:color w:val="000000"/>
-          <w:sz w:val="20"/>
-          <w:szCs w:val="20"/>
-        </w:rPr>
-        <w:t xml:space="preserve"> and reducing fragmented service dependencies.</w:t>
+        <w:t>Building the</w:t>
+      </w:r>
+      <w:r>
+        <w:rPr>
+          <w:rFonts w:ascii="Garamond" w:eastAsia="Garamond" w:hAnsi="Garamond" w:cs="Garamond"/>
+          <w:color w:val="000000"/>
+          <w:sz w:val="20"/>
+          <w:szCs w:val="20"/>
+        </w:rPr>
+        <w:t xml:space="preserve"> APEX Reporting Engine which executes Spectra queries </w:t>
+      </w:r>
+      <w:r>
+        <w:rPr>
+          <w:rFonts w:ascii="Garamond" w:eastAsia="Garamond" w:hAnsi="Garamond" w:cs="Garamond"/>
+          <w:color w:val="000000"/>
+          <w:sz w:val="20"/>
+          <w:szCs w:val="20"/>
+        </w:rPr>
+        <w:t>to</w:t>
+      </w:r>
+      <w:r>
+        <w:rPr>
+          <w:rFonts w:ascii="Garamond" w:eastAsia="Garamond" w:hAnsi="Garamond" w:cs="Garamond"/>
+          <w:color w:val="000000"/>
+          <w:sz w:val="20"/>
+          <w:szCs w:val="20"/>
+        </w:rPr>
+        <w:t xml:space="preserve"> </w:t>
+      </w:r>
+      <w:r>
+        <w:rPr>
+          <w:rFonts w:ascii="Garamond" w:eastAsia="Garamond" w:hAnsi="Garamond" w:cs="Garamond"/>
+          <w:color w:val="000000"/>
+          <w:sz w:val="20"/>
+          <w:szCs w:val="20"/>
+        </w:rPr>
+        <w:t>pull</w:t>
+      </w:r>
+      <w:r>
+        <w:rPr>
+          <w:rFonts w:ascii="Garamond" w:eastAsia="Garamond" w:hAnsi="Garamond" w:cs="Garamond"/>
+          <w:color w:val="000000"/>
+          <w:sz w:val="20"/>
+          <w:szCs w:val="20"/>
+        </w:rPr>
+        <w:t xml:space="preserve"> fund accounting data from </w:t>
+      </w:r>
+      <w:proofErr w:type="spellStart"/>
+      <w:r>
+        <w:rPr>
+          <w:rFonts w:ascii="Garamond" w:eastAsia="Garamond" w:hAnsi="Garamond" w:cs="Garamond"/>
+          <w:color w:val="000000"/>
+          <w:sz w:val="20"/>
+          <w:szCs w:val="20"/>
+        </w:rPr>
+        <w:t>InvestOne</w:t>
+      </w:r>
+      <w:proofErr w:type="spellEnd"/>
+      <w:r>
+        <w:rPr>
+          <w:rFonts w:ascii="Garamond" w:eastAsia="Garamond" w:hAnsi="Garamond" w:cs="Garamond"/>
+          <w:color w:val="000000"/>
+          <w:sz w:val="20"/>
+          <w:szCs w:val="20"/>
+        </w:rPr>
+        <w:t xml:space="preserve"> </w:t>
+      </w:r>
+      <w:r>
+        <w:rPr>
+          <w:rFonts w:ascii="Garamond" w:eastAsia="Garamond" w:hAnsi="Garamond" w:cs="Garamond"/>
+          <w:color w:val="000000"/>
+          <w:sz w:val="20"/>
+          <w:szCs w:val="20"/>
+        </w:rPr>
+        <w:t>and drive</w:t>
+      </w:r>
+      <w:r>
+        <w:rPr>
+          <w:rFonts w:ascii="Garamond" w:eastAsia="Garamond" w:hAnsi="Garamond" w:cs="Garamond"/>
+          <w:color w:val="000000"/>
+          <w:sz w:val="20"/>
+          <w:szCs w:val="20"/>
+        </w:rPr>
+        <w:t xml:space="preserve"> migrat</w:t>
+      </w:r>
+      <w:r>
+        <w:rPr>
+          <w:rFonts w:ascii="Garamond" w:eastAsia="Garamond" w:hAnsi="Garamond" w:cs="Garamond"/>
+          <w:color w:val="000000"/>
+          <w:sz w:val="20"/>
+          <w:szCs w:val="20"/>
+        </w:rPr>
+        <w:t>ion</w:t>
+      </w:r>
+      <w:r>
+        <w:rPr>
+          <w:rFonts w:ascii="Garamond" w:eastAsia="Garamond" w:hAnsi="Garamond" w:cs="Garamond"/>
+          <w:color w:val="000000"/>
+          <w:sz w:val="20"/>
+          <w:szCs w:val="20"/>
+        </w:rPr>
+        <w:t xml:space="preserve"> to </w:t>
+      </w:r>
+      <w:proofErr w:type="spellStart"/>
+      <w:r>
+        <w:rPr>
+          <w:rFonts w:ascii="Garamond" w:eastAsia="Garamond" w:hAnsi="Garamond" w:cs="Garamond"/>
+          <w:color w:val="000000"/>
+          <w:sz w:val="20"/>
+          <w:szCs w:val="20"/>
+        </w:rPr>
+        <w:t>HedgeServ</w:t>
+      </w:r>
+      <w:proofErr w:type="spellEnd"/>
+      <w:r>
+        <w:rPr>
+          <w:rFonts w:ascii="Garamond" w:eastAsia="Garamond" w:hAnsi="Garamond" w:cs="Garamond"/>
+          <w:color w:val="000000"/>
+          <w:sz w:val="20"/>
+          <w:szCs w:val="20"/>
+        </w:rPr>
+        <w:t>.</w:t>
       </w:r>
     </w:p>
     <w:p>
@@ -1445,101 +1418,61 @@
           <w:sz w:val="20"/>
           <w:szCs w:val="20"/>
         </w:rPr>
-        <w:t>Designed</w:t>
-      </w:r>
-      <w:r>
-        <w:rPr>
-          <w:rFonts w:ascii="Garamond" w:eastAsia="Garamond" w:hAnsi="Garamond" w:cs="Garamond"/>
-          <w:color w:val="000000"/>
-          <w:sz w:val="20"/>
-          <w:szCs w:val="20"/>
-        </w:rPr>
-        <w:t xml:space="preserve"> reusable HTTP clients modeled after </w:t>
-      </w:r>
-      <w:proofErr w:type="spellStart"/>
-      <w:r>
-        <w:rPr>
-          <w:rFonts w:ascii="Garamond" w:eastAsia="Garamond" w:hAnsi="Garamond" w:cs="Garamond"/>
-          <w:color w:val="000000"/>
-          <w:sz w:val="20"/>
-          <w:szCs w:val="20"/>
-        </w:rPr>
-        <w:t>CDPClient</w:t>
-      </w:r>
-      <w:proofErr w:type="spellEnd"/>
-      <w:r>
-        <w:rPr>
-          <w:rFonts w:ascii="Garamond" w:eastAsia="Garamond" w:hAnsi="Garamond" w:cs="Garamond"/>
-          <w:color w:val="000000"/>
-          <w:sz w:val="20"/>
-          <w:szCs w:val="20"/>
-        </w:rPr>
-        <w:t xml:space="preserve"> and </w:t>
-      </w:r>
-      <w:proofErr w:type="spellStart"/>
-      <w:r>
-        <w:rPr>
-          <w:rFonts w:ascii="Garamond" w:eastAsia="Garamond" w:hAnsi="Garamond" w:cs="Garamond"/>
-          <w:color w:val="000000"/>
-          <w:sz w:val="20"/>
-          <w:szCs w:val="20"/>
-        </w:rPr>
-        <w:t>WSOClient</w:t>
-      </w:r>
-      <w:proofErr w:type="spellEnd"/>
-      <w:r>
-        <w:rPr>
-          <w:rFonts w:ascii="Garamond" w:eastAsia="Garamond" w:hAnsi="Garamond" w:cs="Garamond"/>
-          <w:color w:val="000000"/>
-          <w:sz w:val="20"/>
-          <w:szCs w:val="20"/>
-        </w:rPr>
-        <w:t xml:space="preserve"> to invoke APEX report query APIs</w:t>
-      </w:r>
-      <w:r>
-        <w:rPr>
-          <w:rFonts w:ascii="Garamond" w:eastAsia="Garamond" w:hAnsi="Garamond" w:cs="Garamond"/>
-          <w:color w:val="000000"/>
-          <w:sz w:val="20"/>
-          <w:szCs w:val="20"/>
-        </w:rPr>
-        <w:t xml:space="preserve">, </w:t>
-      </w:r>
-      <w:r>
-        <w:rPr>
-          <w:rFonts w:ascii="Garamond" w:eastAsia="Garamond" w:hAnsi="Garamond" w:cs="Garamond"/>
-          <w:color w:val="000000"/>
-          <w:sz w:val="20"/>
-          <w:szCs w:val="20"/>
-        </w:rPr>
-        <w:t>standardiz</w:t>
-      </w:r>
-      <w:r>
-        <w:rPr>
-          <w:rFonts w:ascii="Garamond" w:eastAsia="Garamond" w:hAnsi="Garamond" w:cs="Garamond"/>
-          <w:color w:val="000000"/>
-          <w:sz w:val="20"/>
-          <w:szCs w:val="20"/>
-        </w:rPr>
-        <w:t>ing</w:t>
-      </w:r>
-      <w:r>
-        <w:rPr>
-          <w:rFonts w:ascii="Garamond" w:eastAsia="Garamond" w:hAnsi="Garamond" w:cs="Garamond"/>
-          <w:color w:val="000000"/>
-          <w:sz w:val="20"/>
-          <w:szCs w:val="20"/>
-        </w:rPr>
-        <w:t xml:space="preserve"> service-to-service report retrieval</w:t>
-      </w:r>
-      <w:r>
-        <w:rPr>
-          <w:rFonts w:ascii="Garamond" w:eastAsia="Garamond" w:hAnsi="Garamond" w:cs="Garamond"/>
-          <w:color w:val="000000"/>
-          <w:sz w:val="20"/>
-          <w:szCs w:val="20"/>
-        </w:rPr>
-        <w:t xml:space="preserve"> across the platform.</w:t>
+        <w:t>Moved the</w:t>
+      </w:r>
+      <w:r>
+        <w:rPr>
+          <w:rFonts w:ascii="Garamond" w:eastAsia="Garamond" w:hAnsi="Garamond" w:cs="Garamond"/>
+          <w:color w:val="000000"/>
+          <w:sz w:val="20"/>
+          <w:szCs w:val="20"/>
+        </w:rPr>
+        <w:t xml:space="preserve"> </w:t>
+      </w:r>
+      <w:r>
+        <w:rPr>
+          <w:rFonts w:ascii="Garamond" w:eastAsia="Garamond" w:hAnsi="Garamond" w:cs="Garamond"/>
+          <w:color w:val="000000"/>
+          <w:sz w:val="20"/>
+          <w:szCs w:val="20"/>
+        </w:rPr>
+        <w:t>WAM/WAL</w:t>
+      </w:r>
+      <w:r>
+        <w:rPr>
+          <w:rFonts w:ascii="Garamond" w:eastAsia="Garamond" w:hAnsi="Garamond" w:cs="Garamond"/>
+          <w:color w:val="000000"/>
+          <w:sz w:val="20"/>
+          <w:szCs w:val="20"/>
+        </w:rPr>
+        <w:t xml:space="preserve"> calculations </w:t>
+      </w:r>
+      <w:r>
+        <w:rPr>
+          <w:rFonts w:ascii="Garamond" w:eastAsia="Garamond" w:hAnsi="Garamond" w:cs="Garamond"/>
+          <w:color w:val="000000"/>
+          <w:sz w:val="20"/>
+          <w:szCs w:val="20"/>
+        </w:rPr>
+        <w:t xml:space="preserve">logic from EDWAMs </w:t>
+      </w:r>
+      <w:r>
+        <w:rPr>
+          <w:rFonts w:ascii="Garamond" w:eastAsia="Garamond" w:hAnsi="Garamond" w:cs="Garamond"/>
+          <w:color w:val="000000"/>
+          <w:sz w:val="20"/>
+          <w:szCs w:val="20"/>
+        </w:rPr>
+        <w:t>into APEX</w:t>
+      </w:r>
+      <w:r>
+        <w:rPr>
+          <w:rFonts w:ascii="Garamond" w:eastAsia="Garamond" w:hAnsi="Garamond" w:cs="Garamond"/>
+          <w:color w:val="000000"/>
+          <w:sz w:val="20"/>
+          <w:szCs w:val="20"/>
+        </w:rPr>
+        <w:t xml:space="preserve"> to keep the core accounting functionality in one place.</w:t>
       </w:r>
     </w:p>
     <w:p>
@@ -1569,52 +1502,65 @@
           <w:sz w:val="20"/>
           <w:szCs w:val="20"/>
         </w:rPr>
-        <w:t>Working</w:t>
-      </w:r>
-      <w:r>
-        <w:rPr>
-          <w:rFonts w:ascii="Garamond" w:eastAsia="Garamond" w:hAnsi="Garamond" w:cs="Garamond"/>
-          <w:color w:val="000000"/>
-          <w:sz w:val="20"/>
-          <w:szCs w:val="20"/>
-        </w:rPr>
-        <w:t xml:space="preserve"> </w:t>
-      </w:r>
-      <w:r>
-        <w:rPr>
-          <w:rFonts w:ascii="Garamond" w:eastAsia="Garamond" w:hAnsi="Garamond" w:cs="Garamond"/>
-          <w:color w:val="000000"/>
-          <w:sz w:val="20"/>
-          <w:szCs w:val="20"/>
-        </w:rPr>
-        <w:t>in the</w:t>
-      </w:r>
-      <w:r>
-        <w:rPr>
-          <w:rFonts w:ascii="Garamond" w:eastAsia="Garamond" w:hAnsi="Garamond" w:cs="Garamond"/>
-          <w:color w:val="000000"/>
-          <w:sz w:val="20"/>
-          <w:szCs w:val="20"/>
-        </w:rPr>
-        <w:t xml:space="preserve"> Fidelity Funds and Investment Operations </w:t>
-      </w:r>
-      <w:r>
-        <w:rPr>
-          <w:rFonts w:ascii="Garamond" w:eastAsia="Garamond" w:hAnsi="Garamond" w:cs="Garamond"/>
-          <w:color w:val="000000"/>
-          <w:sz w:val="20"/>
-          <w:szCs w:val="20"/>
-        </w:rPr>
-        <w:t xml:space="preserve">department specifically in the </w:t>
-      </w:r>
-      <w:r>
-        <w:rPr>
-          <w:rFonts w:ascii="Garamond" w:eastAsia="Garamond" w:hAnsi="Garamond" w:cs="Garamond"/>
-          <w:color w:val="000000"/>
-          <w:sz w:val="20"/>
-          <w:szCs w:val="20"/>
-        </w:rPr>
-        <w:t>Core Accounting team to support data flow validation, API integration, and migration testing for reporting workflows.</w:t>
+        <w:t>Built</w:t>
+      </w:r>
+      <w:r>
+        <w:rPr>
+          <w:rFonts w:ascii="Garamond" w:eastAsia="Garamond" w:hAnsi="Garamond" w:cs="Garamond"/>
+          <w:color w:val="000000"/>
+          <w:sz w:val="20"/>
+          <w:szCs w:val="20"/>
+        </w:rPr>
+        <w:t xml:space="preserve"> HTTP clients modeled after </w:t>
+      </w:r>
+      <w:proofErr w:type="spellStart"/>
+      <w:r>
+        <w:rPr>
+          <w:rFonts w:ascii="Garamond" w:eastAsia="Garamond" w:hAnsi="Garamond" w:cs="Garamond"/>
+          <w:color w:val="000000"/>
+          <w:sz w:val="20"/>
+          <w:szCs w:val="20"/>
+        </w:rPr>
+        <w:t>CDPClient</w:t>
+      </w:r>
+      <w:proofErr w:type="spellEnd"/>
+      <w:r>
+        <w:rPr>
+          <w:rFonts w:ascii="Garamond" w:eastAsia="Garamond" w:hAnsi="Garamond" w:cs="Garamond"/>
+          <w:color w:val="000000"/>
+          <w:sz w:val="20"/>
+          <w:szCs w:val="20"/>
+        </w:rPr>
+        <w:t xml:space="preserve"> and </w:t>
+      </w:r>
+      <w:proofErr w:type="spellStart"/>
+      <w:r>
+        <w:rPr>
+          <w:rFonts w:ascii="Garamond" w:eastAsia="Garamond" w:hAnsi="Garamond" w:cs="Garamond"/>
+          <w:color w:val="000000"/>
+          <w:sz w:val="20"/>
+          <w:szCs w:val="20"/>
+        </w:rPr>
+        <w:t>WSOClient</w:t>
+      </w:r>
+      <w:proofErr w:type="spellEnd"/>
+      <w:r>
+        <w:rPr>
+          <w:rFonts w:ascii="Garamond" w:eastAsia="Garamond" w:hAnsi="Garamond" w:cs="Garamond"/>
+          <w:color w:val="000000"/>
+          <w:sz w:val="20"/>
+          <w:szCs w:val="20"/>
+        </w:rPr>
+        <w:t xml:space="preserve"> t</w:t>
+      </w:r>
+      <w:r>
+        <w:rPr>
+          <w:rFonts w:ascii="Garamond" w:eastAsia="Garamond" w:hAnsi="Garamond" w:cs="Garamond"/>
+          <w:color w:val="000000"/>
+          <w:sz w:val="20"/>
+          <w:szCs w:val="20"/>
+        </w:rPr>
+        <w:t>hat give services a consistent way to call the APEX report APIs and retrieve data from each other.</w:t>
       </w:r>
     </w:p>
     <w:p>

</xml_diff>